<commit_message>
Added main function to codes. PDF report.
</commit_message>
<xml_diff>
--- a/Stock_Market_Risk_Analysis/Stock Market Risk Analysis.docx
+++ b/Stock_Market_Risk_Analysis/Stock Market Risk Analysis.docx
@@ -108,31 +108,7 @@
           <w:sz w:val="28"/>
           <w:szCs w:val="28"/>
         </w:rPr>
-        <w:t>“</w:t>
-      </w:r>
-      <w:r>
-        <w:rPr>
-          <w:rStyle w:val="normaltextrun"/>
-          <w:rFonts w:ascii="Arial" w:eastAsiaTheme="majorEastAsia" w:hAnsi="Arial" w:cs="Arial"/>
-          <w:b/>
-          <w:bCs/>
-          <w:color w:val="074F6A"/>
-          <w:sz w:val="28"/>
-          <w:szCs w:val="28"/>
-        </w:rPr>
-        <w:t>Stock Market Risk Analysis</w:t>
-      </w:r>
-      <w:r>
-        <w:rPr>
-          <w:rStyle w:val="normaltextrun"/>
-          <w:rFonts w:ascii="Arial" w:eastAsiaTheme="majorEastAsia" w:hAnsi="Arial" w:cs="Arial"/>
-          <w:b/>
-          <w:bCs/>
-          <w:color w:val="074F6A"/>
-          <w:sz w:val="28"/>
-          <w:szCs w:val="28"/>
-        </w:rPr>
-        <w:t>”</w:t>
+        <w:t>“Stock Market Risk Analysis”</w:t>
       </w:r>
       <w:r>
         <w:rPr>
@@ -1042,14 +1018,34 @@
         </w:rPr>
         <w:t xml:space="preserve"> </w:t>
       </w:r>
+      <w:proofErr w:type="spellStart"/>
       <w:r>
         <w:rPr>
           <w:rStyle w:val="eop"/>
           <w:rFonts w:asciiTheme="minorHAnsi" w:eastAsiaTheme="majorEastAsia" w:hAnsiTheme="minorHAnsi"/>
           <w:lang w:val="es-ES_tradnl"/>
         </w:rPr>
-        <w:t>Working Capital / Total Assets</w:t>
-      </w:r>
+        <w:t>Working</w:t>
+      </w:r>
+      <w:proofErr w:type="spellEnd"/>
+      <w:r>
+        <w:rPr>
+          <w:rStyle w:val="eop"/>
+          <w:rFonts w:asciiTheme="minorHAnsi" w:eastAsiaTheme="majorEastAsia" w:hAnsiTheme="minorHAnsi"/>
+          <w:lang w:val="es-ES_tradnl"/>
+        </w:rPr>
+        <w:t xml:space="preserve"> Capital / Total </w:t>
+      </w:r>
+      <w:proofErr w:type="spellStart"/>
+      <w:r>
+        <w:rPr>
+          <w:rStyle w:val="eop"/>
+          <w:rFonts w:asciiTheme="minorHAnsi" w:eastAsiaTheme="majorEastAsia" w:hAnsiTheme="minorHAnsi"/>
+          <w:lang w:val="es-ES_tradnl"/>
+        </w:rPr>
+        <w:t>Assets</w:t>
+      </w:r>
+      <w:proofErr w:type="spellEnd"/>
       <w:r>
         <w:rPr>
           <w:rStyle w:val="eop"/>
@@ -1190,24 +1186,18 @@
           <w:rFonts w:asciiTheme="minorHAnsi" w:eastAsiaTheme="majorEastAsia" w:hAnsiTheme="minorHAnsi"/>
           <w:lang w:val="es-ES_tradnl"/>
         </w:rPr>
-        <w:t xml:space="preserve"> </w:t>
-      </w:r>
+        <w:t xml:space="preserve"> EBIT / Total </w:t>
+      </w:r>
+      <w:proofErr w:type="spellStart"/>
       <w:r>
         <w:rPr>
           <w:rStyle w:val="eop"/>
           <w:rFonts w:asciiTheme="minorHAnsi" w:eastAsiaTheme="majorEastAsia" w:hAnsiTheme="minorHAnsi"/>
           <w:lang w:val="es-ES_tradnl"/>
         </w:rPr>
-        <w:t xml:space="preserve">EBIT </w:t>
-      </w:r>
-      <w:r>
-        <w:rPr>
-          <w:rStyle w:val="eop"/>
-          <w:rFonts w:asciiTheme="minorHAnsi" w:eastAsiaTheme="majorEastAsia" w:hAnsiTheme="minorHAnsi"/>
-          <w:lang w:val="es-ES_tradnl"/>
-        </w:rPr>
-        <w:t>/ Total Assets</w:t>
-      </w:r>
+        <w:t>Assets</w:t>
+      </w:r>
+      <w:proofErr w:type="spellEnd"/>
       <w:r>
         <w:rPr>
           <w:rStyle w:val="eop"/>
@@ -1279,45 +1269,50 @@
         </w:rPr>
         <w:t xml:space="preserve"> </w:t>
       </w:r>
+      <w:proofErr w:type="spellStart"/>
       <w:r>
         <w:rPr>
           <w:rStyle w:val="eop"/>
           <w:rFonts w:asciiTheme="minorHAnsi" w:eastAsiaTheme="majorEastAsia" w:hAnsiTheme="minorHAnsi"/>
           <w:lang w:val="es-ES_tradnl"/>
         </w:rPr>
-        <w:t>Market Value of Equit</w:t>
-      </w:r>
+        <w:t>Market</w:t>
+      </w:r>
+      <w:proofErr w:type="spellEnd"/>
       <w:r>
         <w:rPr>
           <w:rStyle w:val="eop"/>
           <w:rFonts w:asciiTheme="minorHAnsi" w:eastAsiaTheme="majorEastAsia" w:hAnsiTheme="minorHAnsi"/>
           <w:lang w:val="es-ES_tradnl"/>
         </w:rPr>
-        <w:t xml:space="preserve">y </w:t>
-      </w:r>
+        <w:t xml:space="preserve"> </w:t>
+      </w:r>
+      <w:proofErr w:type="spellStart"/>
       <w:r>
         <w:rPr>
           <w:rStyle w:val="eop"/>
           <w:rFonts w:asciiTheme="minorHAnsi" w:eastAsiaTheme="majorEastAsia" w:hAnsiTheme="minorHAnsi"/>
           <w:lang w:val="es-ES_tradnl"/>
         </w:rPr>
-        <w:t>/</w:t>
-      </w:r>
+        <w:t>Value</w:t>
+      </w:r>
+      <w:proofErr w:type="spellEnd"/>
       <w:r>
         <w:rPr>
           <w:rStyle w:val="eop"/>
           <w:rFonts w:asciiTheme="minorHAnsi" w:eastAsiaTheme="majorEastAsia" w:hAnsiTheme="minorHAnsi"/>
           <w:lang w:val="es-ES_tradnl"/>
         </w:rPr>
-        <w:t xml:space="preserve"> </w:t>
-      </w:r>
+        <w:t xml:space="preserve"> of </w:t>
+      </w:r>
+      <w:proofErr w:type="spellStart"/>
       <w:r>
         <w:rPr>
           <w:rStyle w:val="eop"/>
           <w:rFonts w:asciiTheme="minorHAnsi" w:eastAsiaTheme="majorEastAsia" w:hAnsiTheme="minorHAnsi"/>
           <w:lang w:val="es-ES_tradnl"/>
         </w:rPr>
-        <w:t xml:space="preserve">Total </w:t>
+        <w:t>Equit</w:t>
       </w:r>
       <w:r>
         <w:rPr>
@@ -1325,8 +1320,51 @@
           <w:rFonts w:asciiTheme="minorHAnsi" w:eastAsiaTheme="majorEastAsia" w:hAnsiTheme="minorHAnsi"/>
           <w:lang w:val="es-ES_tradnl"/>
         </w:rPr>
+        <w:t>y</w:t>
+      </w:r>
+      <w:proofErr w:type="spellEnd"/>
+      <w:r>
+        <w:rPr>
+          <w:rStyle w:val="eop"/>
+          <w:rFonts w:asciiTheme="minorHAnsi" w:eastAsiaTheme="majorEastAsia" w:hAnsiTheme="minorHAnsi"/>
+          <w:lang w:val="es-ES_tradnl"/>
+        </w:rPr>
+        <w:t xml:space="preserve"> </w:t>
+      </w:r>
+      <w:r>
+        <w:rPr>
+          <w:rStyle w:val="eop"/>
+          <w:rFonts w:asciiTheme="minorHAnsi" w:eastAsiaTheme="majorEastAsia" w:hAnsiTheme="minorHAnsi"/>
+          <w:lang w:val="es-ES_tradnl"/>
+        </w:rPr>
+        <w:t>/</w:t>
+      </w:r>
+      <w:r>
+        <w:rPr>
+          <w:rStyle w:val="eop"/>
+          <w:rFonts w:asciiTheme="minorHAnsi" w:eastAsiaTheme="majorEastAsia" w:hAnsiTheme="minorHAnsi"/>
+          <w:lang w:val="es-ES_tradnl"/>
+        </w:rPr>
+        <w:t xml:space="preserve"> </w:t>
+      </w:r>
+      <w:r>
+        <w:rPr>
+          <w:rStyle w:val="eop"/>
+          <w:rFonts w:asciiTheme="minorHAnsi" w:eastAsiaTheme="majorEastAsia" w:hAnsiTheme="minorHAnsi"/>
+          <w:lang w:val="es-ES_tradnl"/>
+        </w:rPr>
+        <w:t xml:space="preserve">Total </w:t>
+      </w:r>
+      <w:proofErr w:type="spellStart"/>
+      <w:r>
+        <w:rPr>
+          <w:rStyle w:val="eop"/>
+          <w:rFonts w:asciiTheme="minorHAnsi" w:eastAsiaTheme="majorEastAsia" w:hAnsiTheme="minorHAnsi"/>
+          <w:lang w:val="es-ES_tradnl"/>
+        </w:rPr>
         <w:t>Liabilities</w:t>
       </w:r>
+      <w:proofErr w:type="spellEnd"/>
       <w:r>
         <w:rPr>
           <w:rStyle w:val="eop"/>
@@ -1412,91 +1450,85 @@
           <w:rFonts w:asciiTheme="minorHAnsi" w:eastAsiaTheme="majorEastAsia" w:hAnsiTheme="minorHAnsi"/>
           <w:lang w:val="es-ES_tradnl"/>
         </w:rPr>
-        <w:t>/ Total Assets</w:t>
-      </w:r>
+        <w:t xml:space="preserve">/ Total </w:t>
+      </w:r>
+      <w:proofErr w:type="spellStart"/>
       <w:r>
         <w:rPr>
           <w:rStyle w:val="eop"/>
           <w:rFonts w:asciiTheme="minorHAnsi" w:eastAsiaTheme="majorEastAsia" w:hAnsiTheme="minorHAnsi"/>
           <w:lang w:val="es-ES_tradnl"/>
         </w:rPr>
-        <w:t xml:space="preserve"> (Rotación de Activos)</w:t>
-      </w:r>
-    </w:p>
-    <w:p/>
-    <w:p>
-      <w:pPr>
-        <w:jc w:val="both"/>
-      </w:pPr>
-      <w:r>
-        <w:t>Este es considerado como el modelo original y uno de los más utilizados en la industria, sin embargo, fue desarrollado principalmente pensado en industrias manufactureras, por lo que tiene un buen funcionamiento para ese tipo de industria y similares.</w:t>
-      </w:r>
-      <w:r>
-        <w:t xml:space="preserve"> El problema de este modelo es que en la actualidad muchas de las empresas más grandes del mundo no son manufactureras, por lo que el modelo no es el mejor para evaluarlas.</w:t>
-      </w:r>
-    </w:p>
-    <w:p>
-      <w:pPr>
-        <w:jc w:val="both"/>
-      </w:pPr>
-    </w:p>
-    <w:p>
-      <w:pPr>
-        <w:jc w:val="both"/>
-      </w:pPr>
-      <w:r>
-        <w:t xml:space="preserve">Para resolver este problema se introdujo el Altman Z’’-Score, el cual es utilizado para evaluar empresas no </w:t>
-      </w:r>
-      <w:r>
-        <w:t>manufactureras</w:t>
-      </w:r>
-      <w:r>
-        <w:t xml:space="preserve"> y empresas en mercados emergentes.</w:t>
-      </w:r>
-      <w:r>
-        <w:t xml:space="preserve"> El modelo es el siguiente:</w:t>
-      </w:r>
-    </w:p>
-    <w:p>
-      <w:pPr>
-        <w:jc w:val="both"/>
-      </w:pPr>
-    </w:p>
-    <w:p>
-      <w:pPr>
-        <w:pStyle w:val="paragraph"/>
-        <w:spacing w:before="0" w:beforeAutospacing="0" w:after="0" w:afterAutospacing="0"/>
-        <w:jc w:val="both"/>
-        <w:textAlignment w:val="baseline"/>
+        <w:t>Assets</w:t>
+      </w:r>
+      <w:proofErr w:type="spellEnd"/>
+      <w:r>
         <w:rPr>
           <w:rStyle w:val="eop"/>
           <w:rFonts w:asciiTheme="minorHAnsi" w:eastAsiaTheme="majorEastAsia" w:hAnsiTheme="minorHAnsi"/>
           <w:lang w:val="es-ES_tradnl"/>
         </w:rPr>
-      </w:pPr>
-      <w:r>
+        <w:t xml:space="preserve"> (Rotación de Activos)</w:t>
+      </w:r>
+    </w:p>
+    <w:p/>
+    <w:p>
+      <w:pPr>
+        <w:jc w:val="both"/>
+      </w:pPr>
+      <w:r>
+        <w:t>Este es considerado como el modelo original y uno de los más utilizados en la industria, sin embargo, fue desarrollado principalmente pensado en industrias manufactureras, por lo que tiene un buen funcionamiento para ese tipo de industria y similares.</w:t>
+      </w:r>
+      <w:r>
+        <w:t xml:space="preserve"> El problema de este modelo es que en la actualidad muchas de las empresas más grandes del mundo no son manufactureras, por lo que el modelo no es el mejor para evaluarlas.</w:t>
+      </w:r>
+    </w:p>
+    <w:p>
+      <w:pPr>
+        <w:jc w:val="both"/>
+      </w:pPr>
+    </w:p>
+    <w:p>
+      <w:pPr>
+        <w:jc w:val="both"/>
+      </w:pPr>
+      <w:r>
+        <w:t xml:space="preserve">Para resolver este problema se introdujo el Altman Z’’-Score, el cual es utilizado para evaluar empresas no </w:t>
+      </w:r>
+      <w:r>
+        <w:t>manufactureras</w:t>
+      </w:r>
+      <w:r>
+        <w:t xml:space="preserve"> y empresas en mercados emergentes.</w:t>
+      </w:r>
+      <w:r>
+        <w:t xml:space="preserve"> El modelo es el siguiente:</w:t>
+      </w:r>
+    </w:p>
+    <w:p>
+      <w:pPr>
+        <w:jc w:val="both"/>
+      </w:pPr>
+    </w:p>
+    <w:p>
+      <w:pPr>
+        <w:pStyle w:val="paragraph"/>
+        <w:spacing w:before="0" w:beforeAutospacing="0" w:after="0" w:afterAutospacing="0"/>
+        <w:jc w:val="both"/>
+        <w:textAlignment w:val="baseline"/>
         <w:rPr>
           <w:rStyle w:val="eop"/>
           <w:rFonts w:asciiTheme="minorHAnsi" w:eastAsiaTheme="majorEastAsia" w:hAnsiTheme="minorHAnsi"/>
           <w:lang w:val="es-ES_tradnl"/>
         </w:rPr>
-        <w:t>Altman Z</w:t>
-      </w:r>
+      </w:pPr>
       <w:r>
         <w:rPr>
           <w:rStyle w:val="eop"/>
           <w:rFonts w:asciiTheme="minorHAnsi" w:eastAsiaTheme="majorEastAsia" w:hAnsiTheme="minorHAnsi"/>
           <w:lang w:val="es-ES_tradnl"/>
         </w:rPr>
-        <w:t>’’</w:t>
-      </w:r>
-      <w:r>
-        <w:rPr>
-          <w:rStyle w:val="eop"/>
-          <w:rFonts w:asciiTheme="minorHAnsi" w:eastAsiaTheme="majorEastAsia" w:hAnsiTheme="minorHAnsi"/>
-          <w:lang w:val="es-ES_tradnl"/>
-        </w:rPr>
-        <w:t xml:space="preserve">-Score: </w:t>
+        <w:t xml:space="preserve">Altman Z’’-Score: </w:t>
       </w:r>
       <m:oMath>
         <m:r>
@@ -1505,31 +1537,7 @@
             <w:rFonts w:ascii="Cambria Math" w:eastAsiaTheme="majorEastAsia" w:hAnsi="Cambria Math"/>
             <w:lang w:val="es-ES_tradnl"/>
           </w:rPr>
-          <m:t>Z=</m:t>
-        </m:r>
-        <m:r>
-          <w:rPr>
-            <w:rStyle w:val="eop"/>
-            <w:rFonts w:ascii="Cambria Math" w:eastAsiaTheme="majorEastAsia" w:hAnsi="Cambria Math"/>
-            <w:lang w:val="es-ES_tradnl"/>
-          </w:rPr>
-          <m:t>6</m:t>
-        </m:r>
-        <m:r>
-          <w:rPr>
-            <w:rStyle w:val="eop"/>
-            <w:rFonts w:ascii="Cambria Math" w:eastAsiaTheme="majorEastAsia" w:hAnsi="Cambria Math"/>
-            <w:lang w:val="es-ES_tradnl"/>
-          </w:rPr>
-          <m:t>.</m:t>
-        </m:r>
-        <m:r>
-          <w:rPr>
-            <w:rStyle w:val="eop"/>
-            <w:rFonts w:ascii="Cambria Math" w:eastAsiaTheme="majorEastAsia" w:hAnsi="Cambria Math"/>
-            <w:lang w:val="es-ES_tradnl"/>
-          </w:rPr>
-          <m:t>56</m:t>
+          <m:t>Z=6.56</m:t>
         </m:r>
         <m:sSub>
           <m:sSubPr>
@@ -1569,15 +1577,7 @@
             <w:rFonts w:ascii="Cambria Math" w:eastAsiaTheme="majorEastAsia" w:hAnsi="Cambria Math"/>
             <w:lang w:val="es-ES_tradnl"/>
           </w:rPr>
-          <m:t>+</m:t>
-        </m:r>
-        <m:r>
-          <w:rPr>
-            <w:rStyle w:val="eop"/>
-            <w:rFonts w:ascii="Cambria Math" w:eastAsiaTheme="majorEastAsia" w:hAnsi="Cambria Math"/>
-            <w:lang w:val="es-ES_tradnl"/>
-          </w:rPr>
-          <m:t>3.26</m:t>
+          <m:t>+3.26</m:t>
         </m:r>
         <m:sSub>
           <m:sSubPr>
@@ -1617,15 +1617,7 @@
             <w:rFonts w:ascii="Cambria Math" w:eastAsiaTheme="majorEastAsia" w:hAnsi="Cambria Math"/>
             <w:lang w:val="es-ES_tradnl"/>
           </w:rPr>
-          <m:t>+</m:t>
-        </m:r>
-        <m:r>
-          <w:rPr>
-            <w:rStyle w:val="eop"/>
-            <w:rFonts w:ascii="Cambria Math" w:eastAsiaTheme="majorEastAsia" w:hAnsi="Cambria Math"/>
-            <w:lang w:val="es-ES_tradnl"/>
-          </w:rPr>
-          <m:t>6.72</m:t>
+          <m:t>+6.72</m:t>
         </m:r>
         <m:sSub>
           <m:sSubPr>
@@ -1665,15 +1657,7 @@
             <w:rFonts w:ascii="Cambria Math" w:eastAsiaTheme="majorEastAsia" w:hAnsi="Cambria Math"/>
             <w:lang w:val="es-ES_tradnl"/>
           </w:rPr>
-          <m:t>+</m:t>
-        </m:r>
-        <m:r>
-          <w:rPr>
-            <w:rStyle w:val="eop"/>
-            <w:rFonts w:ascii="Cambria Math" w:eastAsiaTheme="majorEastAsia" w:hAnsi="Cambria Math"/>
-            <w:lang w:val="es-ES_tradnl"/>
-          </w:rPr>
-          <m:t>1.05</m:t>
+          <m:t>+1.05</m:t>
         </m:r>
         <m:sSub>
           <m:sSubPr>
@@ -2065,14 +2049,7 @@
                 <w:rFonts w:asciiTheme="minorHAnsi" w:hAnsiTheme="minorHAnsi"/>
                 <w:lang w:val="es-ES_tradnl"/>
               </w:rPr>
-              <w:t>Z’’&gt;</w:t>
-            </w:r>
-            <w:r>
-              <w:rPr>
-                <w:rFonts w:asciiTheme="minorHAnsi" w:hAnsiTheme="minorHAnsi"/>
-                <w:lang w:val="es-ES_tradnl"/>
-              </w:rPr>
-              <w:t>3</w:t>
+              <w:t>Z’’&gt;3</w:t>
             </w:r>
           </w:p>
         </w:tc>
@@ -2115,13 +2092,31 @@
                 <w:lang w:val="es-ES_tradnl"/>
               </w:rPr>
             </w:pPr>
+            <w:proofErr w:type="spellStart"/>
             <w:r>
               <w:rPr>
                 <w:rFonts w:asciiTheme="minorHAnsi" w:hAnsiTheme="minorHAnsi"/>
                 <w:lang w:val="es-ES_tradnl"/>
               </w:rPr>
-              <w:t>Safe Zone</w:t>
+              <w:t>Safe</w:t>
             </w:r>
+            <w:proofErr w:type="spellEnd"/>
+            <w:r>
+              <w:rPr>
+                <w:rFonts w:asciiTheme="minorHAnsi" w:hAnsiTheme="minorHAnsi"/>
+                <w:lang w:val="es-ES_tradnl"/>
+              </w:rPr>
+              <w:t xml:space="preserve"> </w:t>
+            </w:r>
+            <w:proofErr w:type="spellStart"/>
+            <w:r>
+              <w:rPr>
+                <w:rFonts w:asciiTheme="minorHAnsi" w:hAnsiTheme="minorHAnsi"/>
+                <w:lang w:val="es-ES_tradnl"/>
+              </w:rPr>
+              <w:t>Zone</w:t>
+            </w:r>
+            <w:proofErr w:type="spellEnd"/>
           </w:p>
         </w:tc>
         <w:tc>
@@ -2239,8 +2234,17 @@
                 <w:rFonts w:asciiTheme="minorHAnsi" w:hAnsiTheme="minorHAnsi"/>
                 <w:lang w:val="es-ES_tradnl"/>
               </w:rPr>
-              <w:t>Grey Zone</w:t>
+              <w:t xml:space="preserve">Grey </w:t>
             </w:r>
+            <w:proofErr w:type="spellStart"/>
+            <w:r>
+              <w:rPr>
+                <w:rFonts w:asciiTheme="minorHAnsi" w:hAnsiTheme="minorHAnsi"/>
+                <w:lang w:val="es-ES_tradnl"/>
+              </w:rPr>
+              <w:t>Zone</w:t>
+            </w:r>
+            <w:proofErr w:type="spellEnd"/>
           </w:p>
         </w:tc>
         <w:tc>
@@ -2339,13 +2343,31 @@
                 <w:lang w:val="es-ES_tradnl"/>
               </w:rPr>
             </w:pPr>
+            <w:proofErr w:type="spellStart"/>
             <w:r>
               <w:rPr>
                 <w:rFonts w:asciiTheme="minorHAnsi" w:hAnsiTheme="minorHAnsi"/>
                 <w:lang w:val="es-ES_tradnl"/>
               </w:rPr>
-              <w:t>Distress Zone</w:t>
+              <w:t>Distress</w:t>
             </w:r>
+            <w:proofErr w:type="spellEnd"/>
+            <w:r>
+              <w:rPr>
+                <w:rFonts w:asciiTheme="minorHAnsi" w:hAnsiTheme="minorHAnsi"/>
+                <w:lang w:val="es-ES_tradnl"/>
+              </w:rPr>
+              <w:t xml:space="preserve"> </w:t>
+            </w:r>
+            <w:proofErr w:type="spellStart"/>
+            <w:r>
+              <w:rPr>
+                <w:rFonts w:asciiTheme="minorHAnsi" w:hAnsiTheme="minorHAnsi"/>
+                <w:lang w:val="es-ES_tradnl"/>
+              </w:rPr>
+              <w:t>Zone</w:t>
+            </w:r>
+            <w:proofErr w:type="spellEnd"/>
           </w:p>
         </w:tc>
         <w:tc>
@@ -2453,8 +2475,45 @@
           <w:sz w:val="24"/>
           <w:szCs w:val="24"/>
         </w:rPr>
-        <w:t>X₁: Working Capital / Total Assets</w:t>
-      </w:r>
+        <w:t xml:space="preserve">X₁: </w:t>
+      </w:r>
+      <w:proofErr w:type="spellStart"/>
+      <w:r>
+        <w:rPr>
+          <w:rFonts w:asciiTheme="minorHAnsi" w:hAnsiTheme="minorHAnsi"/>
+          <w:b/>
+          <w:bCs/>
+          <w:color w:val="000000" w:themeColor="text1"/>
+          <w:sz w:val="24"/>
+          <w:szCs w:val="24"/>
+        </w:rPr>
+        <w:t>Working</w:t>
+      </w:r>
+      <w:proofErr w:type="spellEnd"/>
+      <w:r>
+        <w:rPr>
+          <w:rFonts w:asciiTheme="minorHAnsi" w:hAnsiTheme="minorHAnsi"/>
+          <w:b/>
+          <w:bCs/>
+          <w:color w:val="000000" w:themeColor="text1"/>
+          <w:sz w:val="24"/>
+          <w:szCs w:val="24"/>
+        </w:rPr>
+        <w:t xml:space="preserve"> Capital / Total </w:t>
+      </w:r>
+      <w:proofErr w:type="spellStart"/>
+      <w:r>
+        <w:rPr>
+          <w:rFonts w:asciiTheme="minorHAnsi" w:hAnsiTheme="minorHAnsi"/>
+          <w:b/>
+          <w:bCs/>
+          <w:color w:val="000000" w:themeColor="text1"/>
+          <w:sz w:val="24"/>
+          <w:szCs w:val="24"/>
+        </w:rPr>
+        <w:t>Assets</w:t>
+      </w:r>
+      <w:proofErr w:type="spellEnd"/>
     </w:p>
     <w:p>
       <w:pPr>
@@ -2473,6 +2532,7 @@
           <w:szCs w:val="24"/>
         </w:rPr>
       </w:pPr>
+      <w:proofErr w:type="spellStart"/>
       <w:r>
         <w:rPr>
           <w:rFonts w:asciiTheme="minorHAnsi" w:hAnsiTheme="minorHAnsi"/>
@@ -2482,7 +2542,19 @@
           <w:sz w:val="24"/>
           <w:szCs w:val="24"/>
         </w:rPr>
-        <w:t>Safe (&gt;0.20):</w:t>
+        <w:t>Safe</w:t>
+      </w:r>
+      <w:proofErr w:type="spellEnd"/>
+      <w:r>
+        <w:rPr>
+          <w:rFonts w:asciiTheme="minorHAnsi" w:hAnsiTheme="minorHAnsi"/>
+          <w:b/>
+          <w:bCs/>
+          <w:color w:val="000000" w:themeColor="text1"/>
+          <w:sz w:val="24"/>
+          <w:szCs w:val="24"/>
+        </w:rPr>
+        <w:t xml:space="preserve"> (&gt;0.20):</w:t>
       </w:r>
       <w:r>
         <w:rPr>
@@ -2536,6 +2608,7 @@
           <w:szCs w:val="24"/>
         </w:rPr>
       </w:pPr>
+      <w:proofErr w:type="spellStart"/>
       <w:r>
         <w:rPr>
           <w:rFonts w:asciiTheme="minorHAnsi" w:hAnsiTheme="minorHAnsi"/>
@@ -2545,7 +2618,19 @@
           <w:sz w:val="24"/>
           <w:szCs w:val="24"/>
         </w:rPr>
-        <w:t xml:space="preserve">Unsafe (&lt;0): </w:t>
+        <w:t>Unsafe</w:t>
+      </w:r>
+      <w:proofErr w:type="spellEnd"/>
+      <w:r>
+        <w:rPr>
+          <w:rFonts w:asciiTheme="minorHAnsi" w:hAnsiTheme="minorHAnsi"/>
+          <w:b/>
+          <w:bCs/>
+          <w:color w:val="000000" w:themeColor="text1"/>
+          <w:sz w:val="24"/>
+          <w:szCs w:val="24"/>
+        </w:rPr>
+        <w:t xml:space="preserve"> (&lt;0): </w:t>
       </w:r>
       <w:r>
         <w:rPr>
@@ -2632,8 +2717,69 @@
           <w:sz w:val="24"/>
           <w:szCs w:val="24"/>
         </w:rPr>
-        <w:t>X₂: Retained Earnings / Total Assets</w:t>
-      </w:r>
+        <w:t xml:space="preserve">X₂: </w:t>
+      </w:r>
+      <w:proofErr w:type="spellStart"/>
+      <w:r>
+        <w:rPr>
+          <w:rFonts w:asciiTheme="minorHAnsi" w:hAnsiTheme="minorHAnsi"/>
+          <w:b/>
+          <w:bCs/>
+          <w:color w:val="000000" w:themeColor="text1"/>
+          <w:sz w:val="24"/>
+          <w:szCs w:val="24"/>
+        </w:rPr>
+        <w:t>Retained</w:t>
+      </w:r>
+      <w:proofErr w:type="spellEnd"/>
+      <w:r>
+        <w:rPr>
+          <w:rFonts w:asciiTheme="minorHAnsi" w:hAnsiTheme="minorHAnsi"/>
+          <w:b/>
+          <w:bCs/>
+          <w:color w:val="000000" w:themeColor="text1"/>
+          <w:sz w:val="24"/>
+          <w:szCs w:val="24"/>
+        </w:rPr>
+        <w:t xml:space="preserve"> </w:t>
+      </w:r>
+      <w:proofErr w:type="spellStart"/>
+      <w:r>
+        <w:rPr>
+          <w:rFonts w:asciiTheme="minorHAnsi" w:hAnsiTheme="minorHAnsi"/>
+          <w:b/>
+          <w:bCs/>
+          <w:color w:val="000000" w:themeColor="text1"/>
+          <w:sz w:val="24"/>
+          <w:szCs w:val="24"/>
+        </w:rPr>
+        <w:t>Earnings</w:t>
+      </w:r>
+      <w:proofErr w:type="spellEnd"/>
+      <w:r>
+        <w:rPr>
+          <w:rFonts w:asciiTheme="minorHAnsi" w:hAnsiTheme="minorHAnsi"/>
+          <w:b/>
+          <w:bCs/>
+          <w:color w:val="000000" w:themeColor="text1"/>
+          <w:sz w:val="24"/>
+          <w:szCs w:val="24"/>
+        </w:rPr>
+        <w:t xml:space="preserve"> / Total </w:t>
+      </w:r>
+      <w:proofErr w:type="spellStart"/>
+      <w:r>
+        <w:rPr>
+          <w:rFonts w:asciiTheme="minorHAnsi" w:hAnsiTheme="minorHAnsi"/>
+          <w:b/>
+          <w:bCs/>
+          <w:color w:val="000000" w:themeColor="text1"/>
+          <w:sz w:val="24"/>
+          <w:szCs w:val="24"/>
+        </w:rPr>
+        <w:t>Assets</w:t>
+      </w:r>
+      <w:proofErr w:type="spellEnd"/>
     </w:p>
     <w:p>
       <w:pPr>
@@ -2650,6 +2796,7 @@
           <w:szCs w:val="24"/>
         </w:rPr>
       </w:pPr>
+      <w:proofErr w:type="spellStart"/>
       <w:r>
         <w:rPr>
           <w:rFonts w:asciiTheme="minorHAnsi" w:hAnsiTheme="minorHAnsi"/>
@@ -2659,7 +2806,19 @@
           <w:sz w:val="24"/>
           <w:szCs w:val="24"/>
         </w:rPr>
-        <w:t>Safe (&gt;0.30):</w:t>
+        <w:t>Safe</w:t>
+      </w:r>
+      <w:proofErr w:type="spellEnd"/>
+      <w:r>
+        <w:rPr>
+          <w:rFonts w:asciiTheme="minorHAnsi" w:hAnsiTheme="minorHAnsi"/>
+          <w:b/>
+          <w:bCs/>
+          <w:color w:val="000000" w:themeColor="text1"/>
+          <w:sz w:val="24"/>
+          <w:szCs w:val="24"/>
+        </w:rPr>
+        <w:t xml:space="preserve"> (&gt;0.30):</w:t>
       </w:r>
       <w:r>
         <w:rPr>
@@ -2695,6 +2854,7 @@
           <w:szCs w:val="24"/>
         </w:rPr>
       </w:pPr>
+      <w:proofErr w:type="spellStart"/>
       <w:r>
         <w:rPr>
           <w:rFonts w:asciiTheme="minorHAnsi" w:hAnsiTheme="minorHAnsi"/>
@@ -2704,7 +2864,19 @@
           <w:sz w:val="24"/>
           <w:szCs w:val="24"/>
         </w:rPr>
-        <w:t>Unsafe (&lt;0):</w:t>
+        <w:t>Unsafe</w:t>
+      </w:r>
+      <w:proofErr w:type="spellEnd"/>
+      <w:r>
+        <w:rPr>
+          <w:rFonts w:asciiTheme="minorHAnsi" w:hAnsiTheme="minorHAnsi"/>
+          <w:b/>
+          <w:bCs/>
+          <w:color w:val="000000" w:themeColor="text1"/>
+          <w:sz w:val="24"/>
+          <w:szCs w:val="24"/>
+        </w:rPr>
+        <w:t xml:space="preserve"> (&lt;0):</w:t>
       </w:r>
       <w:r>
         <w:rPr>
@@ -2791,8 +2963,21 @@
           <w:sz w:val="24"/>
           <w:szCs w:val="24"/>
         </w:rPr>
-        <w:t>X₃: EBIT / Total Assets</w:t>
-      </w:r>
+        <w:t xml:space="preserve">X₃: EBIT / Total </w:t>
+      </w:r>
+      <w:proofErr w:type="spellStart"/>
+      <w:r>
+        <w:rPr>
+          <w:rFonts w:asciiTheme="minorHAnsi" w:hAnsiTheme="minorHAnsi"/>
+          <w:b/>
+          <w:bCs/>
+          <w:color w:val="000000" w:themeColor="text1"/>
+          <w:sz w:val="24"/>
+          <w:szCs w:val="24"/>
+        </w:rPr>
+        <w:t>Assets</w:t>
+      </w:r>
+      <w:proofErr w:type="spellEnd"/>
     </w:p>
     <w:p>
       <w:pPr>
@@ -2809,6 +2994,7 @@
           <w:szCs w:val="24"/>
         </w:rPr>
       </w:pPr>
+      <w:proofErr w:type="spellStart"/>
       <w:r>
         <w:rPr>
           <w:rFonts w:asciiTheme="minorHAnsi" w:hAnsiTheme="minorHAnsi"/>
@@ -2818,7 +3004,19 @@
           <w:sz w:val="24"/>
           <w:szCs w:val="24"/>
         </w:rPr>
-        <w:t>Safe (&gt;0.15):</w:t>
+        <w:t>Safe</w:t>
+      </w:r>
+      <w:proofErr w:type="spellEnd"/>
+      <w:r>
+        <w:rPr>
+          <w:rFonts w:asciiTheme="minorHAnsi" w:hAnsiTheme="minorHAnsi"/>
+          <w:b/>
+          <w:bCs/>
+          <w:color w:val="000000" w:themeColor="text1"/>
+          <w:sz w:val="24"/>
+          <w:szCs w:val="24"/>
+        </w:rPr>
+        <w:t xml:space="preserve"> (&gt;0.15):</w:t>
       </w:r>
       <w:r>
         <w:rPr>
@@ -2854,6 +3052,7 @@
           <w:szCs w:val="24"/>
         </w:rPr>
       </w:pPr>
+      <w:proofErr w:type="spellStart"/>
       <w:r>
         <w:rPr>
           <w:rFonts w:asciiTheme="minorHAnsi" w:hAnsiTheme="minorHAnsi"/>
@@ -2863,7 +3062,19 @@
           <w:sz w:val="24"/>
           <w:szCs w:val="24"/>
         </w:rPr>
-        <w:t>Unsafe (&lt;0.05):</w:t>
+        <w:t>Unsafe</w:t>
+      </w:r>
+      <w:proofErr w:type="spellEnd"/>
+      <w:r>
+        <w:rPr>
+          <w:rFonts w:asciiTheme="minorHAnsi" w:hAnsiTheme="minorHAnsi"/>
+          <w:b/>
+          <w:bCs/>
+          <w:color w:val="000000" w:themeColor="text1"/>
+          <w:sz w:val="24"/>
+          <w:szCs w:val="24"/>
+        </w:rPr>
+        <w:t xml:space="preserve"> (&lt;0.05):</w:t>
       </w:r>
       <w:r>
         <w:rPr>
@@ -2950,8 +3161,117 @@
           <w:sz w:val="24"/>
           <w:szCs w:val="24"/>
         </w:rPr>
-        <w:t>X₄: Market Value Equity / Book Value Total Liabilities</w:t>
-      </w:r>
+        <w:t xml:space="preserve">X₄: </w:t>
+      </w:r>
+      <w:proofErr w:type="spellStart"/>
+      <w:r>
+        <w:rPr>
+          <w:rFonts w:asciiTheme="minorHAnsi" w:hAnsiTheme="minorHAnsi"/>
+          <w:b/>
+          <w:bCs/>
+          <w:color w:val="000000" w:themeColor="text1"/>
+          <w:sz w:val="24"/>
+          <w:szCs w:val="24"/>
+        </w:rPr>
+        <w:t>Market</w:t>
+      </w:r>
+      <w:proofErr w:type="spellEnd"/>
+      <w:r>
+        <w:rPr>
+          <w:rFonts w:asciiTheme="minorHAnsi" w:hAnsiTheme="minorHAnsi"/>
+          <w:b/>
+          <w:bCs/>
+          <w:color w:val="000000" w:themeColor="text1"/>
+          <w:sz w:val="24"/>
+          <w:szCs w:val="24"/>
+        </w:rPr>
+        <w:t xml:space="preserve"> </w:t>
+      </w:r>
+      <w:proofErr w:type="spellStart"/>
+      <w:r>
+        <w:rPr>
+          <w:rFonts w:asciiTheme="minorHAnsi" w:hAnsiTheme="minorHAnsi"/>
+          <w:b/>
+          <w:bCs/>
+          <w:color w:val="000000" w:themeColor="text1"/>
+          <w:sz w:val="24"/>
+          <w:szCs w:val="24"/>
+        </w:rPr>
+        <w:t>Value</w:t>
+      </w:r>
+      <w:proofErr w:type="spellEnd"/>
+      <w:r>
+        <w:rPr>
+          <w:rFonts w:asciiTheme="minorHAnsi" w:hAnsiTheme="minorHAnsi"/>
+          <w:b/>
+          <w:bCs/>
+          <w:color w:val="000000" w:themeColor="text1"/>
+          <w:sz w:val="24"/>
+          <w:szCs w:val="24"/>
+        </w:rPr>
+        <w:t xml:space="preserve"> </w:t>
+      </w:r>
+      <w:proofErr w:type="spellStart"/>
+      <w:r>
+        <w:rPr>
+          <w:rFonts w:asciiTheme="minorHAnsi" w:hAnsiTheme="minorHAnsi"/>
+          <w:b/>
+          <w:bCs/>
+          <w:color w:val="000000" w:themeColor="text1"/>
+          <w:sz w:val="24"/>
+          <w:szCs w:val="24"/>
+        </w:rPr>
+        <w:t>Equity</w:t>
+      </w:r>
+      <w:proofErr w:type="spellEnd"/>
+      <w:r>
+        <w:rPr>
+          <w:rFonts w:asciiTheme="minorHAnsi" w:hAnsiTheme="minorHAnsi"/>
+          <w:b/>
+          <w:bCs/>
+          <w:color w:val="000000" w:themeColor="text1"/>
+          <w:sz w:val="24"/>
+          <w:szCs w:val="24"/>
+        </w:rPr>
+        <w:t xml:space="preserve"> / Book </w:t>
+      </w:r>
+      <w:proofErr w:type="spellStart"/>
+      <w:r>
+        <w:rPr>
+          <w:rFonts w:asciiTheme="minorHAnsi" w:hAnsiTheme="minorHAnsi"/>
+          <w:b/>
+          <w:bCs/>
+          <w:color w:val="000000" w:themeColor="text1"/>
+          <w:sz w:val="24"/>
+          <w:szCs w:val="24"/>
+        </w:rPr>
+        <w:t>Value</w:t>
+      </w:r>
+      <w:proofErr w:type="spellEnd"/>
+      <w:r>
+        <w:rPr>
+          <w:rFonts w:asciiTheme="minorHAnsi" w:hAnsiTheme="minorHAnsi"/>
+          <w:b/>
+          <w:bCs/>
+          <w:color w:val="000000" w:themeColor="text1"/>
+          <w:sz w:val="24"/>
+          <w:szCs w:val="24"/>
+        </w:rPr>
+        <w:t xml:space="preserve"> Total </w:t>
+      </w:r>
+      <w:proofErr w:type="spellStart"/>
+      <w:r>
+        <w:rPr>
+          <w:rFonts w:asciiTheme="minorHAnsi" w:hAnsiTheme="minorHAnsi"/>
+          <w:b/>
+          <w:bCs/>
+          <w:color w:val="000000" w:themeColor="text1"/>
+          <w:sz w:val="24"/>
+          <w:szCs w:val="24"/>
+        </w:rPr>
+        <w:t>Liabilities</w:t>
+      </w:r>
+      <w:proofErr w:type="spellEnd"/>
     </w:p>
     <w:p>
       <w:pPr>
@@ -2967,6 +3287,7 @@
           <w:szCs w:val="24"/>
         </w:rPr>
       </w:pPr>
+      <w:proofErr w:type="spellStart"/>
       <w:r>
         <w:rPr>
           <w:rFonts w:asciiTheme="minorHAnsi" w:hAnsiTheme="minorHAnsi"/>
@@ -2976,7 +3297,19 @@
           <w:sz w:val="24"/>
           <w:szCs w:val="24"/>
         </w:rPr>
-        <w:t>Safe (&gt;2.0):</w:t>
+        <w:t>Safe</w:t>
+      </w:r>
+      <w:proofErr w:type="spellEnd"/>
+      <w:r>
+        <w:rPr>
+          <w:rFonts w:asciiTheme="minorHAnsi" w:hAnsiTheme="minorHAnsi"/>
+          <w:b/>
+          <w:bCs/>
+          <w:color w:val="000000" w:themeColor="text1"/>
+          <w:sz w:val="24"/>
+          <w:szCs w:val="24"/>
+        </w:rPr>
+        <w:t xml:space="preserve"> (&gt;2.0):</w:t>
       </w:r>
       <w:r>
         <w:rPr>
@@ -3011,6 +3344,7 @@
           <w:szCs w:val="24"/>
         </w:rPr>
       </w:pPr>
+      <w:proofErr w:type="spellStart"/>
       <w:r>
         <w:rPr>
           <w:rFonts w:asciiTheme="minorHAnsi" w:hAnsiTheme="minorHAnsi"/>
@@ -3020,16 +3354,48 @@
           <w:sz w:val="24"/>
           <w:szCs w:val="24"/>
         </w:rPr>
-        <w:t>Unsafe (&lt;0.5):</w:t>
-      </w:r>
-      <w:r>
-        <w:rPr>
-          <w:rFonts w:asciiTheme="minorHAnsi" w:hAnsiTheme="minorHAnsi"/>
+        <w:t>Unsafe</w:t>
+      </w:r>
+      <w:proofErr w:type="spellEnd"/>
+      <w:r>
+        <w:rPr>
+          <w:rFonts w:asciiTheme="minorHAnsi" w:hAnsiTheme="minorHAnsi"/>
+          <w:b/>
+          <w:bCs/>
           <w:color w:val="000000" w:themeColor="text1"/>
           <w:sz w:val="24"/>
           <w:szCs w:val="24"/>
         </w:rPr>
-        <w:t xml:space="preserve"> Sobre-apalancamiento crítico, patrimonio insuficiente</w:t>
+        <w:t xml:space="preserve"> (&lt;0.5):</w:t>
+      </w:r>
+      <w:r>
+        <w:rPr>
+          <w:rFonts w:asciiTheme="minorHAnsi" w:hAnsiTheme="minorHAnsi"/>
+          <w:color w:val="000000" w:themeColor="text1"/>
+          <w:sz w:val="24"/>
+          <w:szCs w:val="24"/>
+        </w:rPr>
+        <w:t xml:space="preserve"> </w:t>
+      </w:r>
+      <w:proofErr w:type="spellStart"/>
+      <w:r>
+        <w:rPr>
+          <w:rFonts w:asciiTheme="minorHAnsi" w:hAnsiTheme="minorHAnsi"/>
+          <w:color w:val="000000" w:themeColor="text1"/>
+          <w:sz w:val="24"/>
+          <w:szCs w:val="24"/>
+        </w:rPr>
+        <w:t>Sobre-apalancamiento</w:t>
+      </w:r>
+      <w:proofErr w:type="spellEnd"/>
+      <w:r>
+        <w:rPr>
+          <w:rFonts w:asciiTheme="minorHAnsi" w:hAnsiTheme="minorHAnsi"/>
+          <w:color w:val="000000" w:themeColor="text1"/>
+          <w:sz w:val="24"/>
+          <w:szCs w:val="24"/>
+        </w:rPr>
+        <w:t xml:space="preserve"> crítico, patrimonio insuficiente</w:t>
       </w:r>
       <w:r>
         <w:rPr>
@@ -3106,8 +3472,21 @@
           <w:sz w:val="24"/>
           <w:szCs w:val="24"/>
         </w:rPr>
-        <w:t>X₅: Sales / Total Assets</w:t>
-      </w:r>
+        <w:t xml:space="preserve">X₅: Sales / Total </w:t>
+      </w:r>
+      <w:proofErr w:type="spellStart"/>
+      <w:r>
+        <w:rPr>
+          <w:rFonts w:asciiTheme="minorHAnsi" w:hAnsiTheme="minorHAnsi"/>
+          <w:b/>
+          <w:bCs/>
+          <w:color w:val="000000" w:themeColor="text1"/>
+          <w:sz w:val="24"/>
+          <w:szCs w:val="24"/>
+        </w:rPr>
+        <w:t>Assets</w:t>
+      </w:r>
+      <w:proofErr w:type="spellEnd"/>
     </w:p>
     <w:p>
       <w:pPr>
@@ -3123,6 +3502,7 @@
           <w:szCs w:val="24"/>
         </w:rPr>
       </w:pPr>
+      <w:proofErr w:type="spellStart"/>
       <w:r>
         <w:rPr>
           <w:rFonts w:asciiTheme="minorHAnsi" w:hAnsiTheme="minorHAnsi"/>
@@ -3132,7 +3512,19 @@
           <w:sz w:val="24"/>
           <w:szCs w:val="24"/>
         </w:rPr>
-        <w:t>Safe (&gt;1.5):</w:t>
+        <w:t>Safe</w:t>
+      </w:r>
+      <w:proofErr w:type="spellEnd"/>
+      <w:r>
+        <w:rPr>
+          <w:rFonts w:asciiTheme="minorHAnsi" w:hAnsiTheme="minorHAnsi"/>
+          <w:b/>
+          <w:bCs/>
+          <w:color w:val="000000" w:themeColor="text1"/>
+          <w:sz w:val="24"/>
+          <w:szCs w:val="24"/>
+        </w:rPr>
+        <w:t xml:space="preserve"> (&gt;1.5):</w:t>
       </w:r>
       <w:r>
         <w:rPr>
@@ -3167,6 +3559,7 @@
           <w:szCs w:val="24"/>
         </w:rPr>
       </w:pPr>
+      <w:proofErr w:type="spellStart"/>
       <w:r>
         <w:rPr>
           <w:rFonts w:asciiTheme="minorHAnsi" w:hAnsiTheme="minorHAnsi"/>
@@ -3176,7 +3569,19 @@
           <w:sz w:val="24"/>
           <w:szCs w:val="24"/>
         </w:rPr>
-        <w:t>Unsafe (&lt;0.8):</w:t>
+        <w:t>Unsafe</w:t>
+      </w:r>
+      <w:proofErr w:type="spellEnd"/>
+      <w:r>
+        <w:rPr>
+          <w:rFonts w:asciiTheme="minorHAnsi" w:hAnsiTheme="minorHAnsi"/>
+          <w:b/>
+          <w:bCs/>
+          <w:color w:val="000000" w:themeColor="text1"/>
+          <w:sz w:val="24"/>
+          <w:szCs w:val="24"/>
+        </w:rPr>
+        <w:t xml:space="preserve"> (&lt;0.8):</w:t>
       </w:r>
       <w:r>
         <w:rPr>
@@ -3278,7 +3683,39 @@
           <w:rFonts w:ascii="Aptos" w:hAnsi="Aptos"/>
           <w:lang w:val="es-ES_tradnl"/>
         </w:rPr>
-        <w:t>Para utilizar los modelos se utilizó código en Python el cual extrae de yahoo finance la información anual reportada más reciente.</w:t>
+        <w:t xml:space="preserve">Para utilizar los modelos se utilizó código en Python el cual extrae de </w:t>
+      </w:r>
+      <w:proofErr w:type="spellStart"/>
+      <w:r>
+        <w:rPr>
+          <w:rFonts w:ascii="Aptos" w:hAnsi="Aptos"/>
+          <w:lang w:val="es-ES_tradnl"/>
+        </w:rPr>
+        <w:t>yahoo</w:t>
+      </w:r>
+      <w:proofErr w:type="spellEnd"/>
+      <w:r>
+        <w:rPr>
+          <w:rFonts w:ascii="Aptos" w:hAnsi="Aptos"/>
+          <w:lang w:val="es-ES_tradnl"/>
+        </w:rPr>
+        <w:t xml:space="preserve"> </w:t>
+      </w:r>
+      <w:proofErr w:type="spellStart"/>
+      <w:r>
+        <w:rPr>
+          <w:rFonts w:ascii="Aptos" w:hAnsi="Aptos"/>
+          <w:lang w:val="es-ES_tradnl"/>
+        </w:rPr>
+        <w:t>finance</w:t>
+      </w:r>
+      <w:proofErr w:type="spellEnd"/>
+      <w:r>
+        <w:rPr>
+          <w:rFonts w:ascii="Aptos" w:hAnsi="Aptos"/>
+          <w:lang w:val="es-ES_tradnl"/>
+        </w:rPr>
+        <w:t xml:space="preserve"> la información anual reportada más reciente.</w:t>
       </w:r>
       <w:r>
         <w:rPr>
@@ -3367,12 +3804,6 @@
         <w:gridCol w:w="4680"/>
       </w:tblGrid>
       <w:tr>
-        <w:tblPrEx>
-          <w:tblCellMar>
-            <w:top w:w="0" w:type="dxa"/>
-            <w:bottom w:w="0" w:type="dxa"/>
-          </w:tblCellMar>
-        </w:tblPrEx>
         <w:tc>
           <w:tcPr>
             <w:tcW w:w="4680" w:type="dxa"/>
@@ -3431,18 +3862,67 @@
                 <w:bCs/>
                 <w:color w:val="FFFFFF"/>
               </w:rPr>
-              <w:t>Altman Model</w:t>
+              <w:t xml:space="preserve">Altman </w:t>
             </w:r>
+            <w:proofErr w:type="spellStart"/>
+            <w:r>
+              <w:rPr>
+                <w:b/>
+                <w:bCs/>
+                <w:color w:val="FFFFFF"/>
+              </w:rPr>
+              <w:t>Model</w:t>
+            </w:r>
+            <w:proofErr w:type="spellEnd"/>
           </w:p>
         </w:tc>
       </w:tr>
       <w:tr>
-        <w:tblPrEx>
-          <w:tblCellMar>
-            <w:top w:w="0" w:type="dxa"/>
-            <w:bottom w:w="0" w:type="dxa"/>
-          </w:tblCellMar>
-        </w:tblPrEx>
+        <w:tc>
+          <w:tcPr>
+            <w:tcW w:w="4680" w:type="dxa"/>
+            <w:tcBorders>
+              <w:top w:val="single" w:sz="1" w:space="0" w:color="CCCCCC"/>
+              <w:left w:val="single" w:sz="1" w:space="0" w:color="CCCCCC"/>
+              <w:bottom w:val="single" w:sz="1" w:space="0" w:color="CCCCCC"/>
+              <w:right w:val="single" w:sz="1" w:space="0" w:color="CCCCCC"/>
+            </w:tcBorders>
+            <w:shd w:val="clear" w:color="auto" w:fill="FFFFFF"/>
+            <w:tcMar>
+              <w:top w:w="100" w:type="dxa"/>
+              <w:left w:w="120" w:type="dxa"/>
+              <w:bottom w:w="100" w:type="dxa"/>
+              <w:right w:w="120" w:type="dxa"/>
+            </w:tcMar>
+          </w:tcPr>
+          <w:p>
+            <w:proofErr w:type="spellStart"/>
+            <w:r>
+              <w:rPr>
+                <w:sz w:val="22"/>
+                <w:szCs w:val="22"/>
+              </w:rPr>
+              <w:t>Communication</w:t>
+            </w:r>
+            <w:proofErr w:type="spellEnd"/>
+            <w:r>
+              <w:rPr>
+                <w:sz w:val="22"/>
+                <w:szCs w:val="22"/>
+              </w:rPr>
+              <w:t xml:space="preserve"> </w:t>
+            </w:r>
+            <w:proofErr w:type="spellStart"/>
+            <w:r>
+              <w:rPr>
+                <w:sz w:val="22"/>
+                <w:szCs w:val="22"/>
+              </w:rPr>
+              <w:t>Services</w:t>
+            </w:r>
+            <w:proofErr w:type="spellEnd"/>
+          </w:p>
+        </w:tc>
         <w:tc>
           <w:tcPr>
             <w:tcW w:w="4680" w:type="dxa"/>
@@ -3466,7 +3946,151 @@
                 <w:sz w:val="22"/>
                 <w:szCs w:val="22"/>
               </w:rPr>
-              <w:t>Communication Services</w:t>
+              <w:t>Z"-Score (Non-</w:t>
+            </w:r>
+            <w:proofErr w:type="spellStart"/>
+            <w:r>
+              <w:rPr>
+                <w:sz w:val="22"/>
+                <w:szCs w:val="22"/>
+              </w:rPr>
+              <w:t>Manufacturing</w:t>
+            </w:r>
+            <w:proofErr w:type="spellEnd"/>
+            <w:r>
+              <w:rPr>
+                <w:sz w:val="22"/>
+                <w:szCs w:val="22"/>
+              </w:rPr>
+              <w:t>)</w:t>
+            </w:r>
+          </w:p>
+        </w:tc>
+      </w:tr>
+      <w:tr>
+        <w:tc>
+          <w:tcPr>
+            <w:tcW w:w="4680" w:type="dxa"/>
+            <w:tcBorders>
+              <w:top w:val="single" w:sz="1" w:space="0" w:color="CCCCCC"/>
+              <w:left w:val="single" w:sz="1" w:space="0" w:color="CCCCCC"/>
+              <w:bottom w:val="single" w:sz="1" w:space="0" w:color="CCCCCC"/>
+              <w:right w:val="single" w:sz="1" w:space="0" w:color="CCCCCC"/>
+            </w:tcBorders>
+            <w:shd w:val="clear" w:color="auto" w:fill="F0F0F0"/>
+            <w:tcMar>
+              <w:top w:w="100" w:type="dxa"/>
+              <w:left w:w="120" w:type="dxa"/>
+              <w:bottom w:w="100" w:type="dxa"/>
+              <w:right w:w="120" w:type="dxa"/>
+            </w:tcMar>
+          </w:tcPr>
+          <w:p>
+            <w:proofErr w:type="spellStart"/>
+            <w:r>
+              <w:rPr>
+                <w:sz w:val="22"/>
+                <w:szCs w:val="22"/>
+              </w:rPr>
+              <w:t>Consumer</w:t>
+            </w:r>
+            <w:proofErr w:type="spellEnd"/>
+            <w:r>
+              <w:rPr>
+                <w:sz w:val="22"/>
+                <w:szCs w:val="22"/>
+              </w:rPr>
+              <w:t xml:space="preserve"> </w:t>
+            </w:r>
+            <w:proofErr w:type="spellStart"/>
+            <w:r>
+              <w:rPr>
+                <w:sz w:val="22"/>
+                <w:szCs w:val="22"/>
+              </w:rPr>
+              <w:t>Cyclical</w:t>
+            </w:r>
+            <w:proofErr w:type="spellEnd"/>
+          </w:p>
+        </w:tc>
+        <w:tc>
+          <w:tcPr>
+            <w:tcW w:w="4680" w:type="dxa"/>
+            <w:tcBorders>
+              <w:top w:val="single" w:sz="1" w:space="0" w:color="CCCCCC"/>
+              <w:left w:val="single" w:sz="1" w:space="0" w:color="CCCCCC"/>
+              <w:bottom w:val="single" w:sz="1" w:space="0" w:color="CCCCCC"/>
+              <w:right w:val="single" w:sz="1" w:space="0" w:color="CCCCCC"/>
+            </w:tcBorders>
+            <w:shd w:val="clear" w:color="auto" w:fill="F0F0F0"/>
+            <w:tcMar>
+              <w:top w:w="100" w:type="dxa"/>
+              <w:left w:w="120" w:type="dxa"/>
+              <w:bottom w:w="100" w:type="dxa"/>
+              <w:right w:w="120" w:type="dxa"/>
+            </w:tcMar>
+          </w:tcPr>
+          <w:p>
+            <w:r>
+              <w:rPr>
+                <w:sz w:val="22"/>
+                <w:szCs w:val="22"/>
+              </w:rPr>
+              <w:t>Z"-Score (Non-</w:t>
+            </w:r>
+            <w:proofErr w:type="spellStart"/>
+            <w:r>
+              <w:rPr>
+                <w:sz w:val="22"/>
+                <w:szCs w:val="22"/>
+              </w:rPr>
+              <w:t>Manufacturing</w:t>
+            </w:r>
+            <w:proofErr w:type="spellEnd"/>
+            <w:r>
+              <w:rPr>
+                <w:sz w:val="22"/>
+                <w:szCs w:val="22"/>
+              </w:rPr>
+              <w:t>)</w:t>
+            </w:r>
+          </w:p>
+        </w:tc>
+      </w:tr>
+      <w:tr>
+        <w:tc>
+          <w:tcPr>
+            <w:tcW w:w="4680" w:type="dxa"/>
+            <w:tcBorders>
+              <w:top w:val="single" w:sz="1" w:space="0" w:color="CCCCCC"/>
+              <w:left w:val="single" w:sz="1" w:space="0" w:color="CCCCCC"/>
+              <w:bottom w:val="single" w:sz="1" w:space="0" w:color="CCCCCC"/>
+              <w:right w:val="single" w:sz="1" w:space="0" w:color="CCCCCC"/>
+            </w:tcBorders>
+            <w:shd w:val="clear" w:color="auto" w:fill="FFFFFF"/>
+            <w:tcMar>
+              <w:top w:w="100" w:type="dxa"/>
+              <w:left w:w="120" w:type="dxa"/>
+              <w:bottom w:w="100" w:type="dxa"/>
+              <w:right w:w="120" w:type="dxa"/>
+            </w:tcMar>
+          </w:tcPr>
+          <w:p>
+            <w:proofErr w:type="spellStart"/>
+            <w:r>
+              <w:rPr>
+                <w:sz w:val="22"/>
+                <w:szCs w:val="22"/>
+              </w:rPr>
+              <w:t>Consumer</w:t>
+            </w:r>
+            <w:proofErr w:type="spellEnd"/>
+            <w:r>
+              <w:rPr>
+                <w:sz w:val="22"/>
+                <w:szCs w:val="22"/>
+              </w:rPr>
+              <w:t xml:space="preserve"> Defensive</w:t>
             </w:r>
           </w:p>
         </w:tc>
@@ -3493,142 +4117,12 @@
                 <w:sz w:val="22"/>
                 <w:szCs w:val="22"/>
               </w:rPr>
-              <w:t>Z"-Score (Non-Manufacturing)</w:t>
-            </w:r>
-          </w:p>
-        </w:tc>
-      </w:tr>
-      <w:tr>
-        <w:tblPrEx>
-          <w:tblCellMar>
-            <w:top w:w="0" w:type="dxa"/>
-            <w:bottom w:w="0" w:type="dxa"/>
-          </w:tblCellMar>
-        </w:tblPrEx>
-        <w:tc>
-          <w:tcPr>
-            <w:tcW w:w="4680" w:type="dxa"/>
-            <w:tcBorders>
-              <w:top w:val="single" w:sz="1" w:space="0" w:color="CCCCCC"/>
-              <w:left w:val="single" w:sz="1" w:space="0" w:color="CCCCCC"/>
-              <w:bottom w:val="single" w:sz="1" w:space="0" w:color="CCCCCC"/>
-              <w:right w:val="single" w:sz="1" w:space="0" w:color="CCCCCC"/>
-            </w:tcBorders>
-            <w:shd w:val="clear" w:color="auto" w:fill="F0F0F0"/>
-            <w:tcMar>
-              <w:top w:w="100" w:type="dxa"/>
-              <w:left w:w="120" w:type="dxa"/>
-              <w:bottom w:w="100" w:type="dxa"/>
-              <w:right w:w="120" w:type="dxa"/>
-            </w:tcMar>
-          </w:tcPr>
-          <w:p>
-            <w:r>
-              <w:rPr>
-                <w:sz w:val="22"/>
-                <w:szCs w:val="22"/>
-              </w:rPr>
-              <w:t>Consumer Cyclical</w:t>
-            </w:r>
-          </w:p>
-        </w:tc>
-        <w:tc>
-          <w:tcPr>
-            <w:tcW w:w="4680" w:type="dxa"/>
-            <w:tcBorders>
-              <w:top w:val="single" w:sz="1" w:space="0" w:color="CCCCCC"/>
-              <w:left w:val="single" w:sz="1" w:space="0" w:color="CCCCCC"/>
-              <w:bottom w:val="single" w:sz="1" w:space="0" w:color="CCCCCC"/>
-              <w:right w:val="single" w:sz="1" w:space="0" w:color="CCCCCC"/>
-            </w:tcBorders>
-            <w:shd w:val="clear" w:color="auto" w:fill="F0F0F0"/>
-            <w:tcMar>
-              <w:top w:w="100" w:type="dxa"/>
-              <w:left w:w="120" w:type="dxa"/>
-              <w:bottom w:w="100" w:type="dxa"/>
-              <w:right w:w="120" w:type="dxa"/>
-            </w:tcMar>
-          </w:tcPr>
-          <w:p>
-            <w:r>
-              <w:rPr>
-                <w:sz w:val="22"/>
-                <w:szCs w:val="22"/>
-              </w:rPr>
-              <w:t>Z"-Score (Non-Manufacturing)</w:t>
-            </w:r>
-          </w:p>
-        </w:tc>
-      </w:tr>
-      <w:tr>
-        <w:tblPrEx>
-          <w:tblCellMar>
-            <w:top w:w="0" w:type="dxa"/>
-            <w:bottom w:w="0" w:type="dxa"/>
-          </w:tblCellMar>
-        </w:tblPrEx>
-        <w:tc>
-          <w:tcPr>
-            <w:tcW w:w="4680" w:type="dxa"/>
-            <w:tcBorders>
-              <w:top w:val="single" w:sz="1" w:space="0" w:color="CCCCCC"/>
-              <w:left w:val="single" w:sz="1" w:space="0" w:color="CCCCCC"/>
-              <w:bottom w:val="single" w:sz="1" w:space="0" w:color="CCCCCC"/>
-              <w:right w:val="single" w:sz="1" w:space="0" w:color="CCCCCC"/>
-            </w:tcBorders>
-            <w:shd w:val="clear" w:color="auto" w:fill="FFFFFF"/>
-            <w:tcMar>
-              <w:top w:w="100" w:type="dxa"/>
-              <w:left w:w="120" w:type="dxa"/>
-              <w:bottom w:w="100" w:type="dxa"/>
-              <w:right w:w="120" w:type="dxa"/>
-            </w:tcMar>
-          </w:tcPr>
-          <w:p>
-            <w:r>
-              <w:rPr>
-                <w:sz w:val="22"/>
-                <w:szCs w:val="22"/>
-              </w:rPr>
-              <w:t>Consumer Defensive</w:t>
-            </w:r>
-          </w:p>
-        </w:tc>
-        <w:tc>
-          <w:tcPr>
-            <w:tcW w:w="4680" w:type="dxa"/>
-            <w:tcBorders>
-              <w:top w:val="single" w:sz="1" w:space="0" w:color="CCCCCC"/>
-              <w:left w:val="single" w:sz="1" w:space="0" w:color="CCCCCC"/>
-              <w:bottom w:val="single" w:sz="1" w:space="0" w:color="CCCCCC"/>
-              <w:right w:val="single" w:sz="1" w:space="0" w:color="CCCCCC"/>
-            </w:tcBorders>
-            <w:shd w:val="clear" w:color="auto" w:fill="FFFFFF"/>
-            <w:tcMar>
-              <w:top w:w="100" w:type="dxa"/>
-              <w:left w:w="120" w:type="dxa"/>
-              <w:bottom w:w="100" w:type="dxa"/>
-              <w:right w:w="120" w:type="dxa"/>
-            </w:tcMar>
-          </w:tcPr>
-          <w:p>
-            <w:r>
-              <w:rPr>
-                <w:sz w:val="22"/>
-                <w:szCs w:val="22"/>
-              </w:rPr>
               <w:t>Z-Score (Original)</w:t>
             </w:r>
           </w:p>
         </w:tc>
       </w:tr>
       <w:tr>
-        <w:tblPrEx>
-          <w:tblCellMar>
-            <w:top w:w="0" w:type="dxa"/>
-            <w:bottom w:w="0" w:type="dxa"/>
-          </w:tblCellMar>
-        </w:tblPrEx>
         <w:tc>
           <w:tcPr>
             <w:tcW w:w="4680" w:type="dxa"/>
@@ -3685,12 +4179,6 @@
         </w:tc>
       </w:tr>
       <w:tr>
-        <w:tblPrEx>
-          <w:tblCellMar>
-            <w:top w:w="0" w:type="dxa"/>
-            <w:bottom w:w="0" w:type="dxa"/>
-          </w:tblCellMar>
-        </w:tblPrEx>
         <w:tc>
           <w:tcPr>
             <w:tcW w:w="4680" w:type="dxa"/>
@@ -3709,13 +4197,31 @@
             </w:tcMar>
           </w:tcPr>
           <w:p>
+            <w:proofErr w:type="spellStart"/>
             <w:r>
               <w:rPr>
                 <w:sz w:val="22"/>
                 <w:szCs w:val="22"/>
               </w:rPr>
-              <w:t>Financial Services</w:t>
+              <w:t>Financial</w:t>
             </w:r>
+            <w:proofErr w:type="spellEnd"/>
+            <w:r>
+              <w:rPr>
+                <w:sz w:val="22"/>
+                <w:szCs w:val="22"/>
+              </w:rPr>
+              <w:t xml:space="preserve"> </w:t>
+            </w:r>
+            <w:proofErr w:type="spellStart"/>
+            <w:r>
+              <w:rPr>
+                <w:sz w:val="22"/>
+                <w:szCs w:val="22"/>
+              </w:rPr>
+              <w:t>Services</w:t>
+            </w:r>
+            <w:proofErr w:type="spellEnd"/>
           </w:p>
         </w:tc>
         <w:tc>
@@ -3741,18 +4247,28 @@
                 <w:sz w:val="22"/>
                 <w:szCs w:val="22"/>
               </w:rPr>
-              <w:t>Z"-Score (Non-Manufacturing)</w:t>
+              <w:t>Z"-Score (Non-</w:t>
+            </w:r>
+            <w:proofErr w:type="spellStart"/>
+            <w:r>
+              <w:rPr>
+                <w:sz w:val="22"/>
+                <w:szCs w:val="22"/>
+              </w:rPr>
+              <w:t>Manufacturing</w:t>
+            </w:r>
+            <w:proofErr w:type="spellEnd"/>
+            <w:r>
+              <w:rPr>
+                <w:sz w:val="22"/>
+                <w:szCs w:val="22"/>
+              </w:rPr>
+              <w:t>)</w:t>
             </w:r>
           </w:p>
         </w:tc>
       </w:tr>
       <w:tr>
-        <w:tblPrEx>
-          <w:tblCellMar>
-            <w:top w:w="0" w:type="dxa"/>
-            <w:bottom w:w="0" w:type="dxa"/>
-          </w:tblCellMar>
-        </w:tblPrEx>
         <w:tc>
           <w:tcPr>
             <w:tcW w:w="4680" w:type="dxa"/>
@@ -3771,6 +4287,7 @@
             </w:tcMar>
           </w:tcPr>
           <w:p>
+            <w:proofErr w:type="spellStart"/>
             <w:r>
               <w:rPr>
                 <w:sz w:val="22"/>
@@ -3778,6 +4295,7 @@
               </w:rPr>
               <w:t>Healthcare</w:t>
             </w:r>
+            <w:proofErr w:type="spellEnd"/>
           </w:p>
         </w:tc>
         <w:tc>
@@ -3803,18 +4321,28 @@
                 <w:sz w:val="22"/>
                 <w:szCs w:val="22"/>
               </w:rPr>
-              <w:t>Z"-Score (Non-Manufacturing)</w:t>
+              <w:t>Z"-Score (Non-</w:t>
+            </w:r>
+            <w:proofErr w:type="spellStart"/>
+            <w:r>
+              <w:rPr>
+                <w:sz w:val="22"/>
+                <w:szCs w:val="22"/>
+              </w:rPr>
+              <w:t>Manufacturing</w:t>
+            </w:r>
+            <w:proofErr w:type="spellEnd"/>
+            <w:r>
+              <w:rPr>
+                <w:sz w:val="22"/>
+                <w:szCs w:val="22"/>
+              </w:rPr>
+              <w:t>)</w:t>
             </w:r>
           </w:p>
         </w:tc>
       </w:tr>
       <w:tr>
-        <w:tblPrEx>
-          <w:tblCellMar>
-            <w:top w:w="0" w:type="dxa"/>
-            <w:bottom w:w="0" w:type="dxa"/>
-          </w:tblCellMar>
-        </w:tblPrEx>
         <w:tc>
           <w:tcPr>
             <w:tcW w:w="4680" w:type="dxa"/>
@@ -3833,6 +4361,7 @@
             </w:tcMar>
           </w:tcPr>
           <w:p>
+            <w:proofErr w:type="spellStart"/>
             <w:r>
               <w:rPr>
                 <w:sz w:val="22"/>
@@ -3840,6 +4369,7 @@
               </w:rPr>
               <w:t>Industrials</w:t>
             </w:r>
+            <w:proofErr w:type="spellEnd"/>
           </w:p>
         </w:tc>
         <w:tc>
@@ -3871,12 +4401,6 @@
         </w:tc>
       </w:tr>
       <w:tr>
-        <w:tblPrEx>
-          <w:tblCellMar>
-            <w:top w:w="0" w:type="dxa"/>
-            <w:bottom w:w="0" w:type="dxa"/>
-          </w:tblCellMar>
-        </w:tblPrEx>
         <w:tc>
           <w:tcPr>
             <w:tcW w:w="4680" w:type="dxa"/>
@@ -3895,6 +4419,7 @@
             </w:tcMar>
           </w:tcPr>
           <w:p>
+            <w:proofErr w:type="spellStart"/>
             <w:r>
               <w:rPr>
                 <w:sz w:val="22"/>
@@ -3902,6 +4427,7 @@
               </w:rPr>
               <w:t>Materials</w:t>
             </w:r>
+            <w:proofErr w:type="spellEnd"/>
           </w:p>
         </w:tc>
         <w:tc>
@@ -3933,12 +4459,6 @@
         </w:tc>
       </w:tr>
       <w:tr>
-        <w:tblPrEx>
-          <w:tblCellMar>
-            <w:top w:w="0" w:type="dxa"/>
-            <w:bottom w:w="0" w:type="dxa"/>
-          </w:tblCellMar>
-        </w:tblPrEx>
         <w:tc>
           <w:tcPr>
             <w:tcW w:w="4680" w:type="dxa"/>
@@ -3957,6 +4477,7 @@
             </w:tcMar>
           </w:tcPr>
           <w:p>
+            <w:proofErr w:type="spellStart"/>
             <w:r>
               <w:rPr>
                 <w:sz w:val="22"/>
@@ -3964,6 +4485,7 @@
               </w:rPr>
               <w:t>Technology</w:t>
             </w:r>
+            <w:proofErr w:type="spellEnd"/>
           </w:p>
         </w:tc>
         <w:tc>
@@ -3989,18 +4511,28 @@
                 <w:sz w:val="22"/>
                 <w:szCs w:val="22"/>
               </w:rPr>
-              <w:t>Z"-Score (Non-Manufacturing)</w:t>
+              <w:t>Z"-Score (Non-</w:t>
+            </w:r>
+            <w:proofErr w:type="spellStart"/>
+            <w:r>
+              <w:rPr>
+                <w:sz w:val="22"/>
+                <w:szCs w:val="22"/>
+              </w:rPr>
+              <w:t>Manufacturing</w:t>
+            </w:r>
+            <w:proofErr w:type="spellEnd"/>
+            <w:r>
+              <w:rPr>
+                <w:sz w:val="22"/>
+                <w:szCs w:val="22"/>
+              </w:rPr>
+              <w:t>)</w:t>
             </w:r>
           </w:p>
         </w:tc>
       </w:tr>
       <w:tr>
-        <w:tblPrEx>
-          <w:tblCellMar>
-            <w:top w:w="0" w:type="dxa"/>
-            <w:bottom w:w="0" w:type="dxa"/>
-          </w:tblCellMar>
-        </w:tblPrEx>
         <w:tc>
           <w:tcPr>
             <w:tcW w:w="4680" w:type="dxa"/>
@@ -4019,6 +4551,7 @@
             </w:tcMar>
           </w:tcPr>
           <w:p>
+            <w:proofErr w:type="spellStart"/>
             <w:r>
               <w:rPr>
                 <w:sz w:val="22"/>
@@ -4026,6 +4559,7 @@
               </w:rPr>
               <w:t>Utilities</w:t>
             </w:r>
+            <w:proofErr w:type="spellEnd"/>
           </w:p>
         </w:tc>
         <w:tc>
@@ -4051,7 +4585,23 @@
                 <w:sz w:val="22"/>
                 <w:szCs w:val="22"/>
               </w:rPr>
-              <w:t>Z"-Score (Non-Manufacturing)</w:t>
+              <w:t>Z"-Score (Non-</w:t>
+            </w:r>
+            <w:proofErr w:type="spellStart"/>
+            <w:r>
+              <w:rPr>
+                <w:sz w:val="22"/>
+                <w:szCs w:val="22"/>
+              </w:rPr>
+              <w:t>Manufacturing</w:t>
+            </w:r>
+            <w:proofErr w:type="spellEnd"/>
+            <w:r>
+              <w:rPr>
+                <w:sz w:val="22"/>
+                <w:szCs w:val="22"/>
+              </w:rPr>
+              <w:t>)</w:t>
             </w:r>
           </w:p>
         </w:tc>
@@ -4092,7 +4642,39 @@
           <w:rFonts w:ascii="Aptos" w:hAnsi="Aptos"/>
           <w:lang w:val="es-ES_tradnl"/>
         </w:rPr>
-        <w:t xml:space="preserve"> los resultados se presentan en un dashboard de streamlit.</w:t>
+        <w:t xml:space="preserve"> los resultados se presentan en un </w:t>
+      </w:r>
+      <w:proofErr w:type="spellStart"/>
+      <w:r>
+        <w:rPr>
+          <w:rFonts w:ascii="Aptos" w:hAnsi="Aptos"/>
+          <w:lang w:val="es-ES_tradnl"/>
+        </w:rPr>
+        <w:t>dashboard</w:t>
+      </w:r>
+      <w:proofErr w:type="spellEnd"/>
+      <w:r>
+        <w:rPr>
+          <w:rFonts w:ascii="Aptos" w:hAnsi="Aptos"/>
+          <w:lang w:val="es-ES_tradnl"/>
+        </w:rPr>
+        <w:t xml:space="preserve"> de </w:t>
+      </w:r>
+      <w:proofErr w:type="spellStart"/>
+      <w:r>
+        <w:rPr>
+          <w:rFonts w:ascii="Aptos" w:hAnsi="Aptos"/>
+          <w:lang w:val="es-ES_tradnl"/>
+        </w:rPr>
+        <w:t>streamlit</w:t>
+      </w:r>
+      <w:proofErr w:type="spellEnd"/>
+      <w:r>
+        <w:rPr>
+          <w:rFonts w:ascii="Aptos" w:hAnsi="Aptos"/>
+          <w:lang w:val="es-ES_tradnl"/>
+        </w:rPr>
+        <w:t>.</w:t>
       </w:r>
     </w:p>
     <w:p>
@@ -4121,6 +4703,7 @@
       <w:r>
         <w:rPr>
           <w:rFonts w:ascii="Aptos" w:hAnsi="Aptos"/>
+          <w:noProof/>
           <w:lang w:val="es-ES_tradnl"/>
         </w:rPr>
         <w:drawing>
@@ -4186,6 +4769,7 @@
       <w:r>
         <w:rPr>
           <w:rFonts w:ascii="Aptos" w:hAnsi="Aptos"/>
+          <w:noProof/>
           <w:lang w:val="es-ES_tradnl"/>
         </w:rPr>
         <w:lastRenderedPageBreak/>
@@ -4230,6 +4814,72 @@
       <w:pPr>
         <w:pStyle w:val="paragraph"/>
         <w:spacing w:before="0" w:beforeAutospacing="0" w:after="0" w:afterAutospacing="0"/>
+        <w:jc w:val="center"/>
+        <w:textAlignment w:val="baseline"/>
+        <w:rPr>
+          <w:rFonts w:ascii="Aptos" w:hAnsi="Aptos"/>
+          <w:lang w:val="es-ES_tradnl"/>
+        </w:rPr>
+      </w:pPr>
+    </w:p>
+    <w:p>
+      <w:pPr>
+        <w:pStyle w:val="paragraph"/>
+        <w:spacing w:before="0" w:beforeAutospacing="0" w:after="0" w:afterAutospacing="0"/>
+        <w:jc w:val="center"/>
+        <w:textAlignment w:val="baseline"/>
+        <w:rPr>
+          <w:rFonts w:ascii="Aptos" w:hAnsi="Aptos"/>
+          <w:lang w:val="es-ES_tradnl"/>
+        </w:rPr>
+      </w:pPr>
+      <w:r>
+        <w:rPr>
+          <w:rFonts w:ascii="Aptos" w:hAnsi="Aptos"/>
+          <w:noProof/>
+          <w:lang w:val="es-ES_tradnl"/>
+        </w:rPr>
+        <w:drawing>
+          <wp:inline distT="0" distB="0" distL="0" distR="0" wp14:anchorId="796E9F79" wp14:editId="59C33061">
+            <wp:extent cx="4854102" cy="1388456"/>
+            <wp:effectExtent l="0" t="0" r="0" b="0"/>
+            <wp:docPr id="1030884415" name="Imagen 1"/>
+            <wp:cNvGraphicFramePr>
+              <a:graphicFrameLocks xmlns:a="http://schemas.openxmlformats.org/drawingml/2006/main" noChangeAspect="1"/>
+            </wp:cNvGraphicFramePr>
+            <a:graphic xmlns:a="http://schemas.openxmlformats.org/drawingml/2006/main">
+              <a:graphicData uri="http://schemas.openxmlformats.org/drawingml/2006/picture">
+                <pic:pic xmlns:pic="http://schemas.openxmlformats.org/drawingml/2006/picture">
+                  <pic:nvPicPr>
+                    <pic:cNvPr id="1030884415" name=""/>
+                    <pic:cNvPicPr/>
+                  </pic:nvPicPr>
+                  <pic:blipFill>
+                    <a:blip r:embed="rId10"/>
+                    <a:stretch>
+                      <a:fillRect/>
+                    </a:stretch>
+                  </pic:blipFill>
+                  <pic:spPr>
+                    <a:xfrm>
+                      <a:off x="0" y="0"/>
+                      <a:ext cx="4899737" cy="1401509"/>
+                    </a:xfrm>
+                    <a:prstGeom prst="rect">
+                      <a:avLst/>
+                    </a:prstGeom>
+                  </pic:spPr>
+                </pic:pic>
+              </a:graphicData>
+            </a:graphic>
+          </wp:inline>
+        </w:drawing>
+      </w:r>
+    </w:p>
+    <w:p>
+      <w:pPr>
+        <w:pStyle w:val="paragraph"/>
+        <w:spacing w:before="0" w:beforeAutospacing="0" w:after="0" w:afterAutospacing="0"/>
         <w:jc w:val="both"/>
         <w:textAlignment w:val="baseline"/>
         <w:rPr>
@@ -4355,6 +5005,7 @@
       <w:r>
         <w:rPr>
           <w:rFonts w:ascii="Aptos" w:hAnsi="Aptos"/>
+          <w:noProof/>
           <w:lang w:val="es-ES_tradnl"/>
         </w:rPr>
         <w:drawing>
@@ -4373,7 +5024,7 @@
                     <pic:cNvPicPr/>
                   </pic:nvPicPr>
                   <pic:blipFill>
-                    <a:blip r:embed="rId10"/>
+                    <a:blip r:embed="rId11"/>
                     <a:stretch>
                       <a:fillRect/>
                     </a:stretch>
@@ -4451,8 +5102,10 @@
       <w:r>
         <w:rPr>
           <w:rFonts w:ascii="Aptos" w:hAnsi="Aptos"/>
-          <w:lang w:val="es-ES_tradnl"/>
-        </w:rPr>
+          <w:noProof/>
+          <w:lang w:val="es-ES_tradnl"/>
+        </w:rPr>
+        <w:lastRenderedPageBreak/>
         <w:drawing>
           <wp:inline distT="0" distB="0" distL="0" distR="0" wp14:anchorId="13F7B2AD" wp14:editId="5B8A191D">
             <wp:extent cx="1876925" cy="2288306"/>
@@ -4469,7 +5122,7 @@
                     <pic:cNvPicPr/>
                   </pic:nvPicPr>
                   <pic:blipFill>
-                    <a:blip r:embed="rId11"/>
+                    <a:blip r:embed="rId12"/>
                     <a:stretch>
                       <a:fillRect/>
                     </a:stretch>
@@ -4506,7 +5159,6 @@
           <w:rFonts w:ascii="Aptos" w:hAnsi="Aptos"/>
           <w:lang w:val="es-ES_tradnl"/>
         </w:rPr>
-        <w:lastRenderedPageBreak/>
         <w:t>Existen tres cosas importantes a establecer, umbral de pasivos, valor de mercado de los activos y su volatilidad.</w:t>
       </w:r>
       <w:r>
@@ -4581,6 +5233,7 @@
       <w:r>
         <w:rPr>
           <w:rFonts w:ascii="Aptos" w:hAnsi="Aptos"/>
+          <w:noProof/>
           <w:lang w:val="es-ES_tradnl"/>
         </w:rPr>
         <w:drawing>
@@ -4599,7 +5252,7 @@
                     <pic:cNvPicPr/>
                   </pic:nvPicPr>
                   <pic:blipFill>
-                    <a:blip r:embed="rId12"/>
+                    <a:blip r:embed="rId13"/>
                     <a:stretch>
                       <a:fillRect/>
                     </a:stretch>
@@ -4776,8 +5429,10 @@
       <w:r>
         <w:rPr>
           <w:rFonts w:ascii="Aptos" w:hAnsi="Aptos"/>
-          <w:lang w:val="es-ES_tradnl"/>
-        </w:rPr>
+          <w:noProof/>
+          <w:lang w:val="es-ES_tradnl"/>
+        </w:rPr>
+        <w:lastRenderedPageBreak/>
         <w:drawing>
           <wp:inline distT="0" distB="0" distL="0" distR="0" wp14:anchorId="5C427C4B" wp14:editId="0A42C033">
             <wp:extent cx="3608962" cy="2301438"/>
@@ -4794,7 +5449,7 @@
                     <pic:cNvPicPr/>
                   </pic:nvPicPr>
                   <pic:blipFill>
-                    <a:blip r:embed="rId13"/>
+                    <a:blip r:embed="rId14"/>
                     <a:stretch>
                       <a:fillRect/>
                     </a:stretch>
@@ -4874,7 +5529,6 @@
           <w:rFonts w:ascii="Aptos" w:hAnsi="Aptos"/>
           <w:lang w:val="es-ES_tradnl"/>
         </w:rPr>
-        <w:lastRenderedPageBreak/>
         <w:t>El modelo de Merton depende de tres parámetros fundamentales:</w:t>
       </w:r>
     </w:p>
@@ -4890,6 +5544,7 @@
           <w:lang w:val="es-ES_tradnl"/>
         </w:rPr>
       </w:pPr>
+      <w:proofErr w:type="spellStart"/>
       <w:r>
         <w:rPr>
           <w:rFonts w:ascii="Aptos" w:hAnsi="Aptos"/>
@@ -4897,7 +5552,37 @@
           <w:bCs/>
           <w:lang w:val="es-ES_tradnl"/>
         </w:rPr>
-        <w:t>Distance to Default (DD) - Métrica Principal</w:t>
+        <w:t>Distance</w:t>
+      </w:r>
+      <w:proofErr w:type="spellEnd"/>
+      <w:r>
+        <w:rPr>
+          <w:rFonts w:ascii="Aptos" w:hAnsi="Aptos"/>
+          <w:b/>
+          <w:bCs/>
+          <w:lang w:val="es-ES_tradnl"/>
+        </w:rPr>
+        <w:t xml:space="preserve"> </w:t>
+      </w:r>
+      <w:proofErr w:type="spellStart"/>
+      <w:r>
+        <w:rPr>
+          <w:rFonts w:ascii="Aptos" w:hAnsi="Aptos"/>
+          <w:b/>
+          <w:bCs/>
+          <w:lang w:val="es-ES_tradnl"/>
+        </w:rPr>
+        <w:t>to</w:t>
+      </w:r>
+      <w:proofErr w:type="spellEnd"/>
+      <w:r>
+        <w:rPr>
+          <w:rFonts w:ascii="Aptos" w:hAnsi="Aptos"/>
+          <w:b/>
+          <w:bCs/>
+          <w:lang w:val="es-ES_tradnl"/>
+        </w:rPr>
+        <w:t xml:space="preserve"> Default (DD) - Métrica Principal</w:t>
       </w:r>
     </w:p>
     <w:p>
@@ -4914,6 +5599,7 @@
           <w:lang w:val="es-ES_tradnl"/>
         </w:rPr>
       </w:pPr>
+      <w:proofErr w:type="spellStart"/>
       <w:r>
         <w:rPr>
           <w:rFonts w:ascii="Aptos" w:hAnsi="Aptos"/>
@@ -4921,7 +5607,17 @@
           <w:bCs/>
           <w:lang w:val="es-ES_tradnl"/>
         </w:rPr>
-        <w:t>Safe:</w:t>
+        <w:t>Safe</w:t>
+      </w:r>
+      <w:proofErr w:type="spellEnd"/>
+      <w:r>
+        <w:rPr>
+          <w:rFonts w:ascii="Aptos" w:hAnsi="Aptos"/>
+          <w:b/>
+          <w:bCs/>
+          <w:lang w:val="es-ES_tradnl"/>
+        </w:rPr>
+        <w:t>:</w:t>
       </w:r>
       <w:r>
         <w:rPr>
@@ -4952,6 +5648,7 @@
           <w:lang w:val="es-ES_tradnl"/>
         </w:rPr>
       </w:pPr>
+      <w:proofErr w:type="spellStart"/>
       <w:r>
         <w:rPr>
           <w:rFonts w:ascii="Aptos" w:hAnsi="Aptos"/>
@@ -4959,7 +5656,17 @@
           <w:bCs/>
           <w:lang w:val="es-ES_tradnl"/>
         </w:rPr>
-        <w:t>Moderate:</w:t>
+        <w:t>Moderate</w:t>
+      </w:r>
+      <w:proofErr w:type="spellEnd"/>
+      <w:r>
+        <w:rPr>
+          <w:rFonts w:ascii="Aptos" w:hAnsi="Aptos"/>
+          <w:b/>
+          <w:bCs/>
+          <w:lang w:val="es-ES_tradnl"/>
+        </w:rPr>
+        <w:t>:</w:t>
       </w:r>
       <w:r>
         <w:rPr>
@@ -4990,6 +5697,7 @@
           <w:lang w:val="es-ES_tradnl"/>
         </w:rPr>
       </w:pPr>
+      <w:proofErr w:type="spellStart"/>
       <w:r>
         <w:rPr>
           <w:rFonts w:ascii="Aptos" w:hAnsi="Aptos"/>
@@ -4997,7 +5705,17 @@
           <w:bCs/>
           <w:lang w:val="es-ES_tradnl"/>
         </w:rPr>
-        <w:t>Unsafe:</w:t>
+        <w:t>Unsafe</w:t>
+      </w:r>
+      <w:proofErr w:type="spellEnd"/>
+      <w:r>
+        <w:rPr>
+          <w:rFonts w:ascii="Aptos" w:hAnsi="Aptos"/>
+          <w:b/>
+          <w:bCs/>
+          <w:lang w:val="es-ES_tradnl"/>
+        </w:rPr>
+        <w:t>:</w:t>
       </w:r>
       <w:r>
         <w:rPr>
@@ -5106,6 +5824,7 @@
           <w:lang w:val="es-ES_tradnl"/>
         </w:rPr>
       </w:pPr>
+      <w:proofErr w:type="spellStart"/>
       <w:r>
         <w:rPr>
           <w:rFonts w:ascii="Aptos" w:hAnsi="Aptos"/>
@@ -5113,7 +5832,17 @@
           <w:bCs/>
           <w:lang w:val="es-ES_tradnl"/>
         </w:rPr>
-        <w:t>Safe:</w:t>
+        <w:t>Safe</w:t>
+      </w:r>
+      <w:proofErr w:type="spellEnd"/>
+      <w:r>
+        <w:rPr>
+          <w:rFonts w:ascii="Aptos" w:hAnsi="Aptos"/>
+          <w:b/>
+          <w:bCs/>
+          <w:lang w:val="es-ES_tradnl"/>
+        </w:rPr>
+        <w:t>:</w:t>
       </w:r>
       <w:r>
         <w:rPr>
@@ -5134,7 +5863,55 @@
           <w:rFonts w:ascii="Aptos" w:hAnsi="Aptos"/>
           <w:lang w:val="es-ES_tradnl"/>
         </w:rPr>
-        <w:t xml:space="preserve"> &lt; 20% (utilities, consumer staples)</w:t>
+        <w:t xml:space="preserve"> &lt; 20% (</w:t>
+      </w:r>
+      <w:proofErr w:type="spellStart"/>
+      <w:r>
+        <w:rPr>
+          <w:rFonts w:ascii="Aptos" w:hAnsi="Aptos"/>
+          <w:lang w:val="es-ES_tradnl"/>
+        </w:rPr>
+        <w:t>utilities</w:t>
+      </w:r>
+      <w:proofErr w:type="spellEnd"/>
+      <w:r>
+        <w:rPr>
+          <w:rFonts w:ascii="Aptos" w:hAnsi="Aptos"/>
+          <w:lang w:val="es-ES_tradnl"/>
+        </w:rPr>
+        <w:t xml:space="preserve">, </w:t>
+      </w:r>
+      <w:proofErr w:type="spellStart"/>
+      <w:r>
+        <w:rPr>
+          <w:rFonts w:ascii="Aptos" w:hAnsi="Aptos"/>
+          <w:lang w:val="es-ES_tradnl"/>
+        </w:rPr>
+        <w:t>consumer</w:t>
+      </w:r>
+      <w:proofErr w:type="spellEnd"/>
+      <w:r>
+        <w:rPr>
+          <w:rFonts w:ascii="Aptos" w:hAnsi="Aptos"/>
+          <w:lang w:val="es-ES_tradnl"/>
+        </w:rPr>
+        <w:t xml:space="preserve"> </w:t>
+      </w:r>
+      <w:proofErr w:type="spellStart"/>
+      <w:r>
+        <w:rPr>
+          <w:rFonts w:ascii="Aptos" w:hAnsi="Aptos"/>
+          <w:lang w:val="es-ES_tradnl"/>
+        </w:rPr>
+        <w:t>staples</w:t>
+      </w:r>
+      <w:proofErr w:type="spellEnd"/>
+      <w:r>
+        <w:rPr>
+          <w:rFonts w:ascii="Aptos" w:hAnsi="Aptos"/>
+          <w:lang w:val="es-ES_tradnl"/>
+        </w:rPr>
+        <w:t>)</w:t>
       </w:r>
       <w:r>
         <w:rPr>
@@ -5158,6 +5935,7 @@
           <w:lang w:val="es-ES_tradnl"/>
         </w:rPr>
       </w:pPr>
+      <w:proofErr w:type="spellStart"/>
       <w:r>
         <w:rPr>
           <w:rFonts w:ascii="Aptos" w:hAnsi="Aptos"/>
@@ -5165,7 +5943,17 @@
           <w:bCs/>
           <w:lang w:val="es-ES_tradnl"/>
         </w:rPr>
-        <w:t>Moderate:</w:t>
+        <w:t>Moderate</w:t>
+      </w:r>
+      <w:proofErr w:type="spellEnd"/>
+      <w:r>
+        <w:rPr>
+          <w:rFonts w:ascii="Aptos" w:hAnsi="Aptos"/>
+          <w:b/>
+          <w:bCs/>
+          <w:lang w:val="es-ES_tradnl"/>
+        </w:rPr>
+        <w:t>:</w:t>
       </w:r>
       <w:r>
         <w:rPr>
@@ -5210,6 +5998,7 @@
           <w:lang w:val="es-ES_tradnl"/>
         </w:rPr>
       </w:pPr>
+      <w:proofErr w:type="spellStart"/>
       <w:r>
         <w:rPr>
           <w:rFonts w:ascii="Aptos" w:hAnsi="Aptos"/>
@@ -5217,7 +6006,17 @@
           <w:bCs/>
           <w:lang w:val="es-ES_tradnl"/>
         </w:rPr>
-        <w:t>Unsafe:</w:t>
+        <w:t>Unsafe</w:t>
+      </w:r>
+      <w:proofErr w:type="spellEnd"/>
+      <w:r>
+        <w:rPr>
+          <w:rFonts w:ascii="Aptos" w:hAnsi="Aptos"/>
+          <w:b/>
+          <w:bCs/>
+          <w:lang w:val="es-ES_tradnl"/>
+        </w:rPr>
+        <w:t>:</w:t>
       </w:r>
       <w:r>
         <w:rPr>
@@ -5238,7 +6037,39 @@
           <w:rFonts w:ascii="Aptos" w:hAnsi="Aptos"/>
           <w:lang w:val="es-ES_tradnl"/>
         </w:rPr>
-        <w:t xml:space="preserve"> &gt; 40% (technology, biotech)</w:t>
+        <w:t xml:space="preserve"> &gt; 40% (</w:t>
+      </w:r>
+      <w:proofErr w:type="spellStart"/>
+      <w:r>
+        <w:rPr>
+          <w:rFonts w:ascii="Aptos" w:hAnsi="Aptos"/>
+          <w:lang w:val="es-ES_tradnl"/>
+        </w:rPr>
+        <w:t>technology</w:t>
+      </w:r>
+      <w:proofErr w:type="spellEnd"/>
+      <w:r>
+        <w:rPr>
+          <w:rFonts w:ascii="Aptos" w:hAnsi="Aptos"/>
+          <w:lang w:val="es-ES_tradnl"/>
+        </w:rPr>
+        <w:t xml:space="preserve">, </w:t>
+      </w:r>
+      <w:proofErr w:type="spellStart"/>
+      <w:r>
+        <w:rPr>
+          <w:rFonts w:ascii="Aptos" w:hAnsi="Aptos"/>
+          <w:lang w:val="es-ES_tradnl"/>
+        </w:rPr>
+        <w:t>biotech</w:t>
+      </w:r>
+      <w:proofErr w:type="spellEnd"/>
+      <w:r>
+        <w:rPr>
+          <w:rFonts w:ascii="Aptos" w:hAnsi="Aptos"/>
+          <w:lang w:val="es-ES_tradnl"/>
+        </w:rPr>
+        <w:t>)</w:t>
       </w:r>
       <w:r>
         <w:rPr>
@@ -5389,6 +6220,7 @@
           <w:lang w:val="es-ES_tradnl"/>
         </w:rPr>
       </w:pPr>
+      <w:proofErr w:type="spellStart"/>
       <w:r>
         <w:rPr>
           <w:rFonts w:ascii="Aptos" w:hAnsi="Aptos"/>
@@ -5396,7 +6228,37 @@
           <w:bCs/>
           <w:lang w:val="es-ES_tradnl"/>
         </w:rPr>
-        <w:t>Safe approach:</w:t>
+        <w:t>Safe</w:t>
+      </w:r>
+      <w:proofErr w:type="spellEnd"/>
+      <w:r>
+        <w:rPr>
+          <w:rFonts w:ascii="Aptos" w:hAnsi="Aptos"/>
+          <w:b/>
+          <w:bCs/>
+          <w:lang w:val="es-ES_tradnl"/>
+        </w:rPr>
+        <w:t xml:space="preserve"> </w:t>
+      </w:r>
+      <w:proofErr w:type="spellStart"/>
+      <w:r>
+        <w:rPr>
+          <w:rFonts w:ascii="Aptos" w:hAnsi="Aptos"/>
+          <w:b/>
+          <w:bCs/>
+          <w:lang w:val="es-ES_tradnl"/>
+        </w:rPr>
+        <w:t>approach</w:t>
+      </w:r>
+      <w:proofErr w:type="spellEnd"/>
+      <w:r>
+        <w:rPr>
+          <w:rFonts w:ascii="Aptos" w:hAnsi="Aptos"/>
+          <w:b/>
+          <w:bCs/>
+          <w:lang w:val="es-ES_tradnl"/>
+        </w:rPr>
+        <w:t>:</w:t>
       </w:r>
       <w:r>
         <w:rPr>
@@ -5427,6 +6289,7 @@
           <w:lang w:val="es-ES_tradnl"/>
         </w:rPr>
       </w:pPr>
+      <w:proofErr w:type="spellStart"/>
       <w:r>
         <w:rPr>
           <w:rFonts w:ascii="Aptos" w:hAnsi="Aptos"/>
@@ -5434,7 +6297,17 @@
           <w:bCs/>
           <w:lang w:val="es-ES_tradnl"/>
         </w:rPr>
-        <w:t>Unsafe:</w:t>
+        <w:t>Unsafe</w:t>
+      </w:r>
+      <w:proofErr w:type="spellEnd"/>
+      <w:r>
+        <w:rPr>
+          <w:rFonts w:ascii="Aptos" w:hAnsi="Aptos"/>
+          <w:b/>
+          <w:bCs/>
+          <w:lang w:val="es-ES_tradnl"/>
+        </w:rPr>
+        <w:t>:</w:t>
       </w:r>
       <w:r>
         <w:rPr>
@@ -5508,6 +6381,7 @@
         <w:pStyle w:val="Ttulo2"/>
       </w:pPr>
       <w:r>
+        <w:lastRenderedPageBreak/>
         <w:t>Aplicación</w:t>
       </w:r>
     </w:p>
@@ -5539,7 +6413,39 @@
           <w:rFonts w:ascii="Aptos" w:hAnsi="Aptos"/>
           <w:lang w:val="es-ES_tradnl"/>
         </w:rPr>
-        <w:t xml:space="preserve">Al igual que con el modelo de Altman a través de un código de Python se descargan datos de yahoo finance para obtener los valores requeridos. </w:t>
+        <w:t xml:space="preserve">Al igual que con el modelo de Altman a través de un código de Python se descargan datos de </w:t>
+      </w:r>
+      <w:proofErr w:type="spellStart"/>
+      <w:r>
+        <w:rPr>
+          <w:rFonts w:ascii="Aptos" w:hAnsi="Aptos"/>
+          <w:lang w:val="es-ES_tradnl"/>
+        </w:rPr>
+        <w:t>yahoo</w:t>
+      </w:r>
+      <w:proofErr w:type="spellEnd"/>
+      <w:r>
+        <w:rPr>
+          <w:rFonts w:ascii="Aptos" w:hAnsi="Aptos"/>
+          <w:lang w:val="es-ES_tradnl"/>
+        </w:rPr>
+        <w:t xml:space="preserve"> </w:t>
+      </w:r>
+      <w:proofErr w:type="spellStart"/>
+      <w:r>
+        <w:rPr>
+          <w:rFonts w:ascii="Aptos" w:hAnsi="Aptos"/>
+          <w:lang w:val="es-ES_tradnl"/>
+        </w:rPr>
+        <w:t>finance</w:t>
+      </w:r>
+      <w:proofErr w:type="spellEnd"/>
+      <w:r>
+        <w:rPr>
+          <w:rFonts w:ascii="Aptos" w:hAnsi="Aptos"/>
+          <w:lang w:val="es-ES_tradnl"/>
+        </w:rPr>
+        <w:t xml:space="preserve"> para obtener los valores requeridos. </w:t>
       </w:r>
       <w:r>
         <w:rPr>
@@ -5679,6 +6585,7 @@
       <w:r>
         <w:rPr>
           <w:rFonts w:ascii="Aptos" w:hAnsi="Aptos"/>
+          <w:noProof/>
           <w:lang w:val="es-ES_tradnl"/>
         </w:rPr>
         <w:drawing>
@@ -5697,7 +6604,7 @@
                     <pic:cNvPicPr/>
                   </pic:nvPicPr>
                   <pic:blipFill>
-                    <a:blip r:embed="rId14"/>
+                    <a:blip r:embed="rId15"/>
                     <a:stretch>
                       <a:fillRect/>
                     </a:stretch>
@@ -5758,7 +6665,29 @@
           <w:szCs w:val="16"/>
           <w:lang w:val="es-ES_tradnl"/>
         </w:rPr>
-        <w:t>: FactSet Data</w:t>
+        <w:t xml:space="preserve">: </w:t>
+      </w:r>
+      <w:proofErr w:type="spellStart"/>
+      <w:r>
+        <w:rPr>
+          <w:rFonts w:ascii="Aptos" w:hAnsi="Aptos"/>
+          <w:color w:val="808080" w:themeColor="background1" w:themeShade="80"/>
+          <w:sz w:val="16"/>
+          <w:szCs w:val="16"/>
+          <w:lang w:val="es-ES_tradnl"/>
+        </w:rPr>
+        <w:t>FactSet</w:t>
+      </w:r>
+      <w:proofErr w:type="spellEnd"/>
+      <w:r>
+        <w:rPr>
+          <w:rFonts w:ascii="Aptos" w:hAnsi="Aptos"/>
+          <w:color w:val="808080" w:themeColor="background1" w:themeShade="80"/>
+          <w:sz w:val="16"/>
+          <w:szCs w:val="16"/>
+          <w:lang w:val="es-ES_tradnl"/>
+        </w:rPr>
+        <w:t xml:space="preserve"> Data</w:t>
       </w:r>
     </w:p>
     <w:p>
@@ -5827,7 +6756,39 @@
           <w:rFonts w:ascii="Aptos" w:hAnsi="Aptos"/>
           <w:lang w:val="es-ES_tradnl"/>
         </w:rPr>
-        <w:t>Al igual que con el modelo de Altman los resultados son presentados en un dashboard de streamlit.</w:t>
+        <w:t xml:space="preserve">Al igual que con el modelo de Altman los resultados son presentados en un </w:t>
+      </w:r>
+      <w:proofErr w:type="spellStart"/>
+      <w:r>
+        <w:rPr>
+          <w:rFonts w:ascii="Aptos" w:hAnsi="Aptos"/>
+          <w:lang w:val="es-ES_tradnl"/>
+        </w:rPr>
+        <w:t>dashboard</w:t>
+      </w:r>
+      <w:proofErr w:type="spellEnd"/>
+      <w:r>
+        <w:rPr>
+          <w:rFonts w:ascii="Aptos" w:hAnsi="Aptos"/>
+          <w:lang w:val="es-ES_tradnl"/>
+        </w:rPr>
+        <w:t xml:space="preserve"> de </w:t>
+      </w:r>
+      <w:proofErr w:type="spellStart"/>
+      <w:r>
+        <w:rPr>
+          <w:rFonts w:ascii="Aptos" w:hAnsi="Aptos"/>
+          <w:lang w:val="es-ES_tradnl"/>
+        </w:rPr>
+        <w:t>streamlit</w:t>
+      </w:r>
+      <w:proofErr w:type="spellEnd"/>
+      <w:r>
+        <w:rPr>
+          <w:rFonts w:ascii="Aptos" w:hAnsi="Aptos"/>
+          <w:lang w:val="es-ES_tradnl"/>
+        </w:rPr>
+        <w:t>.</w:t>
       </w:r>
     </w:p>
     <w:p>
@@ -5903,6 +6864,7 @@
       <w:r>
         <w:rPr>
           <w:rFonts w:ascii="Aptos" w:hAnsi="Aptos"/>
+          <w:noProof/>
           <w:lang w:val="es-ES_tradnl"/>
         </w:rPr>
         <w:drawing>
@@ -5921,7 +6883,7 @@
                     <pic:cNvPicPr/>
                   </pic:nvPicPr>
                   <pic:blipFill>
-                    <a:blip r:embed="rId15"/>
+                    <a:blip r:embed="rId16"/>
                     <a:stretch>
                       <a:fillRect/>
                     </a:stretch>
@@ -5991,9 +6953,9 @@
       <w:r>
         <w:rPr>
           <w:rFonts w:ascii="Aptos" w:hAnsi="Aptos"/>
-          <w:lang w:val="es-ES_tradnl"/>
-        </w:rPr>
-        <w:lastRenderedPageBreak/>
+          <w:noProof/>
+          <w:lang w:val="es-ES_tradnl"/>
+        </w:rPr>
         <w:drawing>
           <wp:inline distT="0" distB="0" distL="0" distR="0" wp14:anchorId="0D6DC478" wp14:editId="23C22B37">
             <wp:extent cx="4357991" cy="1605524"/>
@@ -6010,7 +6972,7 @@
                     <pic:cNvPicPr/>
                   </pic:nvPicPr>
                   <pic:blipFill>
-                    <a:blip r:embed="rId16"/>
+                    <a:blip r:embed="rId17"/>
                     <a:stretch>
                       <a:fillRect/>
                     </a:stretch>
@@ -6019,6 +6981,95 @@
                     <a:xfrm>
                       <a:off x="0" y="0"/>
                       <a:ext cx="4417874" cy="1627585"/>
+                    </a:xfrm>
+                    <a:prstGeom prst="rect">
+                      <a:avLst/>
+                    </a:prstGeom>
+                  </pic:spPr>
+                </pic:pic>
+              </a:graphicData>
+            </a:graphic>
+          </wp:inline>
+        </w:drawing>
+      </w:r>
+    </w:p>
+    <w:p>
+      <w:pPr>
+        <w:pStyle w:val="paragraph"/>
+        <w:spacing w:before="0" w:beforeAutospacing="0" w:after="0" w:afterAutospacing="0"/>
+        <w:jc w:val="center"/>
+        <w:textAlignment w:val="baseline"/>
+        <w:rPr>
+          <w:rFonts w:ascii="Aptos" w:hAnsi="Aptos"/>
+          <w:lang w:val="es-ES_tradnl"/>
+        </w:rPr>
+      </w:pPr>
+    </w:p>
+    <w:p>
+      <w:pPr>
+        <w:pStyle w:val="paragraph"/>
+        <w:spacing w:before="0" w:beforeAutospacing="0" w:after="0" w:afterAutospacing="0"/>
+        <w:jc w:val="both"/>
+        <w:textAlignment w:val="baseline"/>
+        <w:rPr>
+          <w:rFonts w:ascii="Aptos" w:hAnsi="Aptos"/>
+          <w:b/>
+          <w:bCs/>
+          <w:lang w:val="es-ES_tradnl"/>
+        </w:rPr>
+      </w:pPr>
+      <w:r>
+        <w:rPr>
+          <w:rFonts w:ascii="Aptos" w:hAnsi="Aptos"/>
+          <w:b/>
+          <w:bCs/>
+          <w:lang w:val="es-ES_tradnl"/>
+        </w:rPr>
+        <w:t>WBD</w:t>
+      </w:r>
+    </w:p>
+    <w:p>
+      <w:pPr>
+        <w:pStyle w:val="paragraph"/>
+        <w:spacing w:before="0" w:beforeAutospacing="0" w:after="0" w:afterAutospacing="0"/>
+        <w:jc w:val="center"/>
+        <w:textAlignment w:val="baseline"/>
+        <w:rPr>
+          <w:rFonts w:ascii="Aptos" w:hAnsi="Aptos"/>
+          <w:lang w:val="es-ES_tradnl"/>
+        </w:rPr>
+      </w:pPr>
+      <w:r>
+        <w:rPr>
+          <w:rFonts w:ascii="Aptos" w:hAnsi="Aptos"/>
+          <w:noProof/>
+          <w:lang w:val="es-ES_tradnl"/>
+        </w:rPr>
+        <w:drawing>
+          <wp:inline distT="0" distB="0" distL="0" distR="0" wp14:anchorId="75A1D285" wp14:editId="57A77868">
+            <wp:extent cx="4357992" cy="1650889"/>
+            <wp:effectExtent l="0" t="0" r="0" b="635"/>
+            <wp:docPr id="1439518791" name="Imagen 1"/>
+            <wp:cNvGraphicFramePr>
+              <a:graphicFrameLocks xmlns:a="http://schemas.openxmlformats.org/drawingml/2006/main" noChangeAspect="1"/>
+            </wp:cNvGraphicFramePr>
+            <a:graphic xmlns:a="http://schemas.openxmlformats.org/drawingml/2006/main">
+              <a:graphicData uri="http://schemas.openxmlformats.org/drawingml/2006/picture">
+                <pic:pic xmlns:pic="http://schemas.openxmlformats.org/drawingml/2006/picture">
+                  <pic:nvPicPr>
+                    <pic:cNvPr id="1439518791" name=""/>
+                    <pic:cNvPicPr/>
+                  </pic:nvPicPr>
+                  <pic:blipFill>
+                    <a:blip r:embed="rId18"/>
+                    <a:stretch>
+                      <a:fillRect/>
+                    </a:stretch>
+                  </pic:blipFill>
+                  <pic:spPr>
+                    <a:xfrm>
+                      <a:off x="0" y="0"/>
+                      <a:ext cx="4427411" cy="1677186"/>
                     </a:xfrm>
                     <a:prstGeom prst="rect">
                       <a:avLst/>
@@ -6672,6 +7723,7 @@
               <w:rPr>
                 <w:rFonts w:ascii="Arial" w:hAnsi="Arial" w:cs="Arial"/>
               </w:rPr>
+              <w:lastRenderedPageBreak/>
               <w:t>6</w:t>
             </w:r>
           </w:p>
@@ -6907,6 +7959,7 @@
       <w:r>
         <w:rPr>
           <w:rFonts w:ascii="Aptos" w:hAnsi="Aptos"/>
+          <w:noProof/>
           <w:lang w:val="es-ES_tradnl"/>
         </w:rPr>
         <w:drawing>
@@ -6925,7 +7978,7 @@
                     <pic:cNvPicPr/>
                   </pic:nvPicPr>
                   <pic:blipFill>
-                    <a:blip r:embed="rId17"/>
+                    <a:blip r:embed="rId19"/>
                     <a:stretch>
                       <a:fillRect/>
                     </a:stretch>
@@ -6995,9 +8048,9 @@
       <w:r>
         <w:rPr>
           <w:rFonts w:ascii="Aptos" w:hAnsi="Aptos"/>
-          <w:lang w:val="es-ES_tradnl"/>
-        </w:rPr>
-        <w:lastRenderedPageBreak/>
+          <w:noProof/>
+          <w:lang w:val="es-ES_tradnl"/>
+        </w:rPr>
         <w:drawing>
           <wp:inline distT="0" distB="0" distL="0" distR="0" wp14:anchorId="0C088A0E" wp14:editId="456B0B3A">
             <wp:extent cx="5612130" cy="1450975"/>
@@ -7014,7 +8067,7 @@
                     <pic:cNvPicPr/>
                   </pic:nvPicPr>
                   <pic:blipFill>
-                    <a:blip r:embed="rId18"/>
+                    <a:blip r:embed="rId20"/>
                     <a:stretch>
                       <a:fillRect/>
                     </a:stretch>
@@ -7049,15 +8102,126 @@
     </w:p>
     <w:p>
       <w:pPr>
-        <w:pStyle w:val="Ttulo2"/>
-      </w:pPr>
-      <w:r>
+        <w:pStyle w:val="paragraph"/>
+        <w:spacing w:before="0" w:beforeAutospacing="0" w:after="0" w:afterAutospacing="0"/>
+        <w:jc w:val="both"/>
+        <w:textAlignment w:val="baseline"/>
+        <w:rPr>
+          <w:rFonts w:ascii="Aptos" w:hAnsi="Aptos"/>
+          <w:b/>
+          <w:bCs/>
+          <w:lang w:val="es-ES_tradnl"/>
+        </w:rPr>
+      </w:pPr>
+      <w:r>
+        <w:rPr>
+          <w:rFonts w:ascii="Aptos" w:hAnsi="Aptos"/>
+          <w:b/>
+          <w:bCs/>
+          <w:lang w:val="es-ES_tradnl"/>
+        </w:rPr>
+        <w:t>WBD</w:t>
+      </w:r>
+    </w:p>
+    <w:p>
+      <w:pPr>
+        <w:pStyle w:val="paragraph"/>
+        <w:spacing w:before="0" w:beforeAutospacing="0" w:after="0" w:afterAutospacing="0"/>
+        <w:jc w:val="both"/>
+        <w:textAlignment w:val="baseline"/>
+        <w:rPr>
+          <w:rFonts w:ascii="Aptos" w:hAnsi="Aptos"/>
+          <w:lang w:val="es-ES_tradnl"/>
+        </w:rPr>
+      </w:pPr>
+      <w:r>
+        <w:rPr>
+          <w:rFonts w:ascii="Aptos" w:hAnsi="Aptos"/>
+          <w:noProof/>
+          <w:lang w:val="es-ES_tradnl"/>
+        </w:rPr>
+        <w:drawing>
+          <wp:inline distT="0" distB="0" distL="0" distR="0" wp14:anchorId="6B6A8757" wp14:editId="131BA66E">
+            <wp:extent cx="5612130" cy="1436370"/>
+            <wp:effectExtent l="0" t="0" r="1270" b="0"/>
+            <wp:docPr id="833193998" name="Imagen 1"/>
+            <wp:cNvGraphicFramePr>
+              <a:graphicFrameLocks xmlns:a="http://schemas.openxmlformats.org/drawingml/2006/main" noChangeAspect="1"/>
+            </wp:cNvGraphicFramePr>
+            <a:graphic xmlns:a="http://schemas.openxmlformats.org/drawingml/2006/main">
+              <a:graphicData uri="http://schemas.openxmlformats.org/drawingml/2006/picture">
+                <pic:pic xmlns:pic="http://schemas.openxmlformats.org/drawingml/2006/picture">
+                  <pic:nvPicPr>
+                    <pic:cNvPr id="833193998" name=""/>
+                    <pic:cNvPicPr/>
+                  </pic:nvPicPr>
+                  <pic:blipFill>
+                    <a:blip r:embed="rId21"/>
+                    <a:stretch>
+                      <a:fillRect/>
+                    </a:stretch>
+                  </pic:blipFill>
+                  <pic:spPr>
+                    <a:xfrm>
+                      <a:off x="0" y="0"/>
+                      <a:ext cx="5612130" cy="1436370"/>
+                    </a:xfrm>
+                    <a:prstGeom prst="rect">
+                      <a:avLst/>
+                    </a:prstGeom>
+                  </pic:spPr>
+                </pic:pic>
+              </a:graphicData>
+            </a:graphic>
+          </wp:inline>
+        </w:drawing>
+      </w:r>
+    </w:p>
+    <w:p>
+      <w:pPr>
+        <w:pStyle w:val="paragraph"/>
+        <w:spacing w:before="0" w:beforeAutospacing="0" w:after="0" w:afterAutospacing="0"/>
+        <w:jc w:val="both"/>
+        <w:textAlignment w:val="baseline"/>
+        <w:rPr>
+          <w:rFonts w:ascii="Aptos" w:hAnsi="Aptos"/>
+          <w:lang w:val="es-ES_tradnl"/>
+        </w:rPr>
+      </w:pPr>
+    </w:p>
+    <w:p>
+      <w:pPr>
+        <w:pStyle w:val="Ttulo1"/>
+      </w:pPr>
+      <w:r>
+        <w:lastRenderedPageBreak/>
         <w:t xml:space="preserve">Referencias </w:t>
       </w:r>
     </w:p>
     <w:p>
-      <w:r>
-        <w:t xml:space="preserve">Yahoo Finance. (2025). Financial data [Data set]. </w:t>
+      <w:proofErr w:type="spellStart"/>
+      <w:r>
+        <w:t>Yahoo</w:t>
+      </w:r>
+      <w:proofErr w:type="spellEnd"/>
+      <w:r>
+        <w:t xml:space="preserve"> </w:t>
+      </w:r>
+      <w:proofErr w:type="spellStart"/>
+      <w:r>
+        <w:t>Finance</w:t>
+      </w:r>
+      <w:proofErr w:type="spellEnd"/>
+      <w:r>
+        <w:t xml:space="preserve">. (2025). </w:t>
+      </w:r>
+      <w:proofErr w:type="spellStart"/>
+      <w:r>
+        <w:t>Financial</w:t>
+      </w:r>
+      <w:proofErr w:type="spellEnd"/>
+      <w:r>
+        <w:t xml:space="preserve"> data [Data set]. </w:t>
       </w:r>
       <w:r>
         <w:t>Recuperado 20 de feb. de 26</w:t>
@@ -7071,7 +8235,7 @@
       <w:r>
         <w:t xml:space="preserve"> </w:t>
       </w:r>
-      <w:hyperlink r:id="rId19" w:history="1">
+      <w:hyperlink r:id="rId22" w:history="1">
         <w:r>
           <w:rPr>
             <w:rStyle w:val="Hipervnculo"/>
@@ -7082,20 +8246,56 @@
     </w:p>
     <w:p/>
     <w:p>
-      <w:r>
-        <w:t xml:space="preserve">FactSet Research Systems Inc. (2025). </w:t>
-      </w:r>
-      <w:r>
-        <w:t>S&amp;P 500</w:t>
+      <w:proofErr w:type="spellStart"/>
+      <w:r>
+        <w:t>FactSet</w:t>
+      </w:r>
+      <w:proofErr w:type="spellEnd"/>
+      <w:r>
+        <w:t xml:space="preserve"> </w:t>
+      </w:r>
+      <w:proofErr w:type="spellStart"/>
+      <w:r>
+        <w:t>Research</w:t>
+      </w:r>
+      <w:proofErr w:type="spellEnd"/>
+      <w:r>
+        <w:t xml:space="preserve"> </w:t>
+      </w:r>
+      <w:proofErr w:type="spellStart"/>
+      <w:r>
+        <w:t>Systems</w:t>
+      </w:r>
+      <w:proofErr w:type="spellEnd"/>
+      <w:r>
+        <w:t xml:space="preserve"> Inc. (2025). S&amp;P 500. </w:t>
+      </w:r>
+      <w:proofErr w:type="spellStart"/>
+      <w:r>
+        <w:t>Valuation</w:t>
+      </w:r>
+      <w:proofErr w:type="spellEnd"/>
+      <w:r>
+        <w:t xml:space="preserve"> Data</w:t>
       </w:r>
       <w:r>
         <w:t xml:space="preserve">. </w:t>
       </w:r>
-      <w:r>
-        <w:t>Valuation Data</w:t>
-      </w:r>
-      <w:r>
-        <w:t xml:space="preserve">. FactSet [Database]. </w:t>
+      <w:proofErr w:type="spellStart"/>
+      <w:r>
+        <w:t>FactSet</w:t>
+      </w:r>
+      <w:proofErr w:type="spellEnd"/>
+      <w:r>
+        <w:t xml:space="preserve"> [</w:t>
+      </w:r>
+      <w:proofErr w:type="spellStart"/>
+      <w:r>
+        <w:t>Database</w:t>
+      </w:r>
+      <w:proofErr w:type="spellEnd"/>
+      <w:r>
+        <w:t xml:space="preserve">]. </w:t>
       </w:r>
       <w:r>
         <w:t>Recuperado 20 de feb. de 26</w:t>
@@ -7107,29 +8307,382 @@
     <w:p/>
     <w:p>
       <w:r>
-        <w:t xml:space="preserve">Altman, E. I. (2000). Predicting financial distress of companies: Revisiting the </w:t>
-      </w:r>
-    </w:p>
-    <w:p>
-      <w:r>
-        <w:t xml:space="preserve">    Z-Score and ZETA® models. Stern School of Business, New York University.</w:t>
+        <w:t xml:space="preserve">Altman, E. I. (2000). </w:t>
+      </w:r>
+      <w:proofErr w:type="spellStart"/>
+      <w:r>
+        <w:t>Predicting</w:t>
+      </w:r>
+      <w:proofErr w:type="spellEnd"/>
+      <w:r>
+        <w:t xml:space="preserve"> </w:t>
+      </w:r>
+      <w:proofErr w:type="spellStart"/>
+      <w:r>
+        <w:t>financial</w:t>
+      </w:r>
+      <w:proofErr w:type="spellEnd"/>
+      <w:r>
+        <w:t xml:space="preserve"> </w:t>
+      </w:r>
+      <w:proofErr w:type="spellStart"/>
+      <w:r>
+        <w:t>distress</w:t>
+      </w:r>
+      <w:proofErr w:type="spellEnd"/>
+      <w:r>
+        <w:t xml:space="preserve"> of </w:t>
+      </w:r>
+      <w:proofErr w:type="spellStart"/>
+      <w:r>
+        <w:t>companies</w:t>
+      </w:r>
+      <w:proofErr w:type="spellEnd"/>
+      <w:r>
+        <w:t xml:space="preserve">: </w:t>
+      </w:r>
+      <w:proofErr w:type="spellStart"/>
+      <w:r>
+        <w:t>Revisiting</w:t>
+      </w:r>
+      <w:proofErr w:type="spellEnd"/>
+      <w:r>
+        <w:t xml:space="preserve"> </w:t>
+      </w:r>
+      <w:proofErr w:type="spellStart"/>
+      <w:r>
+        <w:t>the</w:t>
+      </w:r>
+      <w:proofErr w:type="spellEnd"/>
+      <w:r>
+        <w:t xml:space="preserve"> </w:t>
+      </w:r>
+    </w:p>
+    <w:p>
+      <w:r>
+        <w:t xml:space="preserve">    Z-Score and ZETA® </w:t>
+      </w:r>
+      <w:proofErr w:type="spellStart"/>
+      <w:r>
+        <w:t>models</w:t>
+      </w:r>
+      <w:proofErr w:type="spellEnd"/>
+      <w:r>
+        <w:t xml:space="preserve">. Stern </w:t>
+      </w:r>
+      <w:proofErr w:type="spellStart"/>
+      <w:r>
+        <w:t>School</w:t>
+      </w:r>
+      <w:proofErr w:type="spellEnd"/>
+      <w:r>
+        <w:t xml:space="preserve"> of Business, New York </w:t>
+      </w:r>
+      <w:proofErr w:type="spellStart"/>
+      <w:r>
+        <w:t>University</w:t>
+      </w:r>
+      <w:proofErr w:type="spellEnd"/>
+      <w:r>
+        <w:t>.</w:t>
       </w:r>
     </w:p>
     <w:p/>
     <w:p>
-      <w:r>
-        <w:t xml:space="preserve">Crosbie, P. J., &amp; Bohn, J. R. (2003). Modeling default risk. KMV, LLC. </w:t>
-      </w:r>
-    </w:p>
-    <w:p>
-      <w:r>
-        <w:t xml:space="preserve">    (Original work published 1993, revised 2002)</w:t>
+      <w:proofErr w:type="spellStart"/>
+      <w:r>
+        <w:t>Crosbie</w:t>
+      </w:r>
+      <w:proofErr w:type="spellEnd"/>
+      <w:r>
+        <w:t xml:space="preserve">, P. J., &amp; </w:t>
+      </w:r>
+      <w:proofErr w:type="spellStart"/>
+      <w:r>
+        <w:t>Bohn</w:t>
+      </w:r>
+      <w:proofErr w:type="spellEnd"/>
+      <w:r>
+        <w:t xml:space="preserve">, J. R. (2003). </w:t>
+      </w:r>
+      <w:proofErr w:type="spellStart"/>
+      <w:r>
+        <w:t>Modeling</w:t>
+      </w:r>
+      <w:proofErr w:type="spellEnd"/>
+      <w:r>
+        <w:t xml:space="preserve"> default risk. KMV, LLC. </w:t>
+      </w:r>
+    </w:p>
+    <w:p>
+      <w:r>
+        <w:t xml:space="preserve">    (Original </w:t>
+      </w:r>
+      <w:proofErr w:type="spellStart"/>
+      <w:r>
+        <w:t>work</w:t>
+      </w:r>
+      <w:proofErr w:type="spellEnd"/>
+      <w:r>
+        <w:t xml:space="preserve"> </w:t>
+      </w:r>
+      <w:proofErr w:type="spellStart"/>
+      <w:r>
+        <w:t>published</w:t>
+      </w:r>
+      <w:proofErr w:type="spellEnd"/>
+      <w:r>
+        <w:t xml:space="preserve"> 1993, </w:t>
+      </w:r>
+      <w:proofErr w:type="spellStart"/>
+      <w:r>
+        <w:t>revised</w:t>
+      </w:r>
+      <w:proofErr w:type="spellEnd"/>
+      <w:r>
+        <w:t xml:space="preserve"> 2002)</w:t>
       </w:r>
     </w:p>
     <w:p/>
     <w:p>
       <w:r>
         <w:t>Diapositivas vistas en clase.</w:t>
+      </w:r>
+    </w:p>
+    <w:p/>
+    <w:p>
+      <w:pPr>
+        <w:pStyle w:val="Ttulo1"/>
+      </w:pPr>
+      <w:r>
+        <w:t>Anexos</w:t>
+      </w:r>
+    </w:p>
+    <w:p>
+      <w:r>
+        <w:t>Diagramas de código funcional.</w:t>
+      </w:r>
+    </w:p>
+    <w:p/>
+    <w:p>
+      <w:r>
+        <w:rPr>
+          <w:noProof/>
+        </w:rPr>
+        <w:drawing>
+          <wp:inline distT="0" distB="0" distL="0" distR="0" wp14:anchorId="248D49AB" wp14:editId="4B3AD2AE">
+            <wp:extent cx="5612130" cy="1492250"/>
+            <wp:effectExtent l="0" t="0" r="1270" b="6350"/>
+            <wp:docPr id="1854158976" name="Imagen 1"/>
+            <wp:cNvGraphicFramePr>
+              <a:graphicFrameLocks xmlns:a="http://schemas.openxmlformats.org/drawingml/2006/main" noChangeAspect="1"/>
+            </wp:cNvGraphicFramePr>
+            <a:graphic xmlns:a="http://schemas.openxmlformats.org/drawingml/2006/main">
+              <a:graphicData uri="http://schemas.openxmlformats.org/drawingml/2006/picture">
+                <pic:pic xmlns:pic="http://schemas.openxmlformats.org/drawingml/2006/picture">
+                  <pic:nvPicPr>
+                    <pic:cNvPr id="1854158976" name="Imagen 1854158976"/>
+                    <pic:cNvPicPr/>
+                  </pic:nvPicPr>
+                  <pic:blipFill>
+                    <a:blip r:embed="rId23" cstate="print">
+                      <a:extLst>
+                        <a:ext uri="{28A0092B-C50C-407E-A947-70E740481C1C}">
+                          <a14:useLocalDpi xmlns:a14="http://schemas.microsoft.com/office/drawing/2010/main" val="0"/>
+                        </a:ext>
+                      </a:extLst>
+                    </a:blip>
+                    <a:stretch>
+                      <a:fillRect/>
+                    </a:stretch>
+                  </pic:blipFill>
+                  <pic:spPr>
+                    <a:xfrm>
+                      <a:off x="0" y="0"/>
+                      <a:ext cx="5612130" cy="1492250"/>
+                    </a:xfrm>
+                    <a:prstGeom prst="rect">
+                      <a:avLst/>
+                    </a:prstGeom>
+                  </pic:spPr>
+                </pic:pic>
+              </a:graphicData>
+            </a:graphic>
+          </wp:inline>
+        </w:drawing>
+      </w:r>
+    </w:p>
+    <w:p>
+      <w:pPr>
+        <w:jc w:val="center"/>
+      </w:pPr>
+      <w:r>
+        <w:rPr>
+          <w:noProof/>
+        </w:rPr>
+        <w:drawing>
+          <wp:inline distT="0" distB="0" distL="0" distR="0" wp14:anchorId="56804B8F" wp14:editId="1DFAAFBB">
+            <wp:extent cx="4863627" cy="2714526"/>
+            <wp:effectExtent l="0" t="0" r="635" b="3810"/>
+            <wp:docPr id="1224821378" name="Imagen 4"/>
+            <wp:cNvGraphicFramePr>
+              <a:graphicFrameLocks xmlns:a="http://schemas.openxmlformats.org/drawingml/2006/main" noChangeAspect="1"/>
+            </wp:cNvGraphicFramePr>
+            <a:graphic xmlns:a="http://schemas.openxmlformats.org/drawingml/2006/main">
+              <a:graphicData uri="http://schemas.openxmlformats.org/drawingml/2006/picture">
+                <pic:pic xmlns:pic="http://schemas.openxmlformats.org/drawingml/2006/picture">
+                  <pic:nvPicPr>
+                    <pic:cNvPr id="1224821378" name="Imagen 1224821378"/>
+                    <pic:cNvPicPr/>
+                  </pic:nvPicPr>
+                  <pic:blipFill rotWithShape="1">
+                    <a:blip r:embed="rId24" cstate="print">
+                      <a:extLst>
+                        <a:ext uri="{28A0092B-C50C-407E-A947-70E740481C1C}">
+                          <a14:useLocalDpi xmlns:a14="http://schemas.microsoft.com/office/drawing/2010/main" val="0"/>
+                        </a:ext>
+                      </a:extLst>
+                    </a:blip>
+                    <a:srcRect t="14790" b="10799"/>
+                    <a:stretch>
+                      <a:fillRect/>
+                    </a:stretch>
+                  </pic:blipFill>
+                  <pic:spPr bwMode="auto">
+                    <a:xfrm>
+                      <a:off x="0" y="0"/>
+                      <a:ext cx="4872286" cy="2719359"/>
+                    </a:xfrm>
+                    <a:prstGeom prst="rect">
+                      <a:avLst/>
+                    </a:prstGeom>
+                    <a:ln>
+                      <a:noFill/>
+                    </a:ln>
+                    <a:extLst>
+                      <a:ext uri="{53640926-AAD7-44D8-BBD7-CCE9431645EC}">
+                        <a14:shadowObscured xmlns:a14="http://schemas.microsoft.com/office/drawing/2010/main"/>
+                      </a:ext>
+                    </a:extLst>
+                  </pic:spPr>
+                </pic:pic>
+              </a:graphicData>
+            </a:graphic>
+          </wp:inline>
+        </w:drawing>
+      </w:r>
+    </w:p>
+    <w:p>
+      <w:pPr>
+        <w:jc w:val="center"/>
+      </w:pPr>
+    </w:p>
+    <w:p>
+      <w:r>
+        <w:rPr>
+          <w:noProof/>
+        </w:rPr>
+        <w:drawing>
+          <wp:inline distT="0" distB="0" distL="0" distR="0" wp14:anchorId="19120527" wp14:editId="1C60DE3F">
+            <wp:extent cx="5612130" cy="1364615"/>
+            <wp:effectExtent l="0" t="0" r="1270" b="0"/>
+            <wp:docPr id="1400285623" name="Imagen 2"/>
+            <wp:cNvGraphicFramePr>
+              <a:graphicFrameLocks xmlns:a="http://schemas.openxmlformats.org/drawingml/2006/main" noChangeAspect="1"/>
+            </wp:cNvGraphicFramePr>
+            <a:graphic xmlns:a="http://schemas.openxmlformats.org/drawingml/2006/main">
+              <a:graphicData uri="http://schemas.openxmlformats.org/drawingml/2006/picture">
+                <pic:pic xmlns:pic="http://schemas.openxmlformats.org/drawingml/2006/picture">
+                  <pic:nvPicPr>
+                    <pic:cNvPr id="1400285623" name="Imagen 1400285623"/>
+                    <pic:cNvPicPr/>
+                  </pic:nvPicPr>
+                  <pic:blipFill>
+                    <a:blip r:embed="rId25" cstate="print">
+                      <a:extLst>
+                        <a:ext uri="{28A0092B-C50C-407E-A947-70E740481C1C}">
+                          <a14:useLocalDpi xmlns:a14="http://schemas.microsoft.com/office/drawing/2010/main" val="0"/>
+                        </a:ext>
+                      </a:extLst>
+                    </a:blip>
+                    <a:stretch>
+                      <a:fillRect/>
+                    </a:stretch>
+                  </pic:blipFill>
+                  <pic:spPr>
+                    <a:xfrm>
+                      <a:off x="0" y="0"/>
+                      <a:ext cx="5612130" cy="1364615"/>
+                    </a:xfrm>
+                    <a:prstGeom prst="rect">
+                      <a:avLst/>
+                    </a:prstGeom>
+                  </pic:spPr>
+                </pic:pic>
+              </a:graphicData>
+            </a:graphic>
+          </wp:inline>
+        </w:drawing>
+      </w:r>
+    </w:p>
+    <w:p>
+      <w:pPr>
+        <w:jc w:val="center"/>
+      </w:pPr>
+      <w:r>
+        <w:rPr>
+          <w:noProof/>
+        </w:rPr>
+        <w:drawing>
+          <wp:inline distT="0" distB="0" distL="0" distR="0" wp14:anchorId="5B7C0EA3" wp14:editId="414A7B07">
+            <wp:extent cx="4124528" cy="2116151"/>
+            <wp:effectExtent l="0" t="0" r="3175" b="5080"/>
+            <wp:docPr id="1234319506" name="Imagen 3"/>
+            <wp:cNvGraphicFramePr>
+              <a:graphicFrameLocks xmlns:a="http://schemas.openxmlformats.org/drawingml/2006/main" noChangeAspect="1"/>
+            </wp:cNvGraphicFramePr>
+            <a:graphic xmlns:a="http://schemas.openxmlformats.org/drawingml/2006/main">
+              <a:graphicData uri="http://schemas.openxmlformats.org/drawingml/2006/picture">
+                <pic:pic xmlns:pic="http://schemas.openxmlformats.org/drawingml/2006/picture">
+                  <pic:nvPicPr>
+                    <pic:cNvPr id="1234319506" name="Imagen 1234319506"/>
+                    <pic:cNvPicPr/>
+                  </pic:nvPicPr>
+                  <pic:blipFill rotWithShape="1">
+                    <a:blip r:embed="rId26" cstate="print">
+                      <a:extLst>
+                        <a:ext uri="{28A0092B-C50C-407E-A947-70E740481C1C}">
+                          <a14:useLocalDpi xmlns:a14="http://schemas.microsoft.com/office/drawing/2010/main" val="0"/>
+                        </a:ext>
+                      </a:extLst>
+                    </a:blip>
+                    <a:srcRect b="31597"/>
+                    <a:stretch>
+                      <a:fillRect/>
+                    </a:stretch>
+                  </pic:blipFill>
+                  <pic:spPr bwMode="auto">
+                    <a:xfrm>
+                      <a:off x="0" y="0"/>
+                      <a:ext cx="4134404" cy="2121218"/>
+                    </a:xfrm>
+                    <a:prstGeom prst="rect">
+                      <a:avLst/>
+                    </a:prstGeom>
+                    <a:ln>
+                      <a:noFill/>
+                    </a:ln>
+                    <a:extLst>
+                      <a:ext uri="{53640926-AAD7-44D8-BBD7-CCE9431645EC}">
+                        <a14:shadowObscured xmlns:a14="http://schemas.microsoft.com/office/drawing/2010/main"/>
+                      </a:ext>
+                    </a:extLst>
+                  </pic:spPr>
+                </pic:pic>
+              </a:graphicData>
+            </a:graphic>
+          </wp:inline>
+        </w:drawing>
       </w:r>
     </w:p>
     <w:sectPr>

</xml_diff>